<commit_message>
ndb adversary-complaint and motion-brief: typst and docx on the shared cross-engine layout model, Times New Roman on both (27.6 pt double, 13.8 pt single; the ')' caption one row per line); make-reference.sh and reference.docx (EB Garamond, failing DEF-FONT-002) give way to docx/reference.xml (base="xengine", {font}) and one shared ndb-court-form.lua; docx XENG-001..003 pass, params.cross_engine: gate; typst 9 and docx 13 checks passed, 0 failed on both (fb-595.68.9)
</commit_message>
<xml_diff>
--- a/courts/eighth-circuit/north-dakota/federal/bankruptcy-district/adversary-complaint/usage/OUTPUT-adversary-complaint.docx
+++ b/courts/eighth-circuit/north-dakota/federal/bankruptcy-district/adversary-complaint/usage/OUTPUT-adversary-complaint.docx
@@ -4,41 +4,43 @@
   <w:body>
     <w:p>
       <w:pPr>
-        <w:pStyle w:val="CourtName"/>
-      </w:pPr>
-      <w:r>
+        <w:spacing w:before="0" w:after="0" w:line="276" w:lineRule="exact"/>
+        <w:ind w:left="0" w:firstLine="0"/>
+        <w:jc w:val="center"/>
+      </w:pPr>
+      <w:r>
+        <w:rPr>
+          <w:b/>
+          <w:bCs/>
+        </w:rPr>
         <w:t xml:space="preserve">IN THE UNITED STATES BANKRUPTCY COURT</w:t>
       </w:r>
     </w:p>
     <w:p>
       <w:pPr>
-        <w:pStyle w:val="CourtName"/>
-      </w:pPr>
-      <w:r>
+        <w:spacing w:before="0" w:after="552" w:line="276" w:lineRule="exact"/>
+        <w:ind w:left="0" w:firstLine="0"/>
+        <w:jc w:val="center"/>
+      </w:pPr>
+      <w:r>
+        <w:rPr>
+          <w:b/>
+          <w:bCs/>
+        </w:rPr>
         <w:t xml:space="preserve">FOR THE DISTRICT OF NORTH DAKOTA</w:t>
       </w:r>
-    </w:p>
-    <w:p>
-      <w:pPr>
-        <w:pStyle w:val="BodyText"/>
-      </w:pPr>
     </w:p>
     <w:tbl>
       <w:tblPr>
         <w:tblW w:w="9360" w:type="dxa"/>
         <w:tblLayout w:type="fixed"/>
-        <w:tblBorders>
-          <w:top w:val="nil"/>
-          <w:left w:val="nil"/>
-          <w:bottom w:val="nil"/>
-          <w:right w:val="nil"/>
-          <w:insideH w:val="nil"/>
-          <w:insideV w:val="nil"/>
-        </w:tblBorders>
         <w:tblCellMar>
+          <w:top w:w="0" w:type="dxa"/>
           <w:left w:w="0" w:type="dxa"/>
+          <w:bottom w:w="0" w:type="dxa"/>
           <w:right w:w="0" w:type="dxa"/>
         </w:tblCellMar>
+        <w:tblLook w:val="0000" w:firstRow="0" w:lastRow="0" w:firstColumn="0" w:lastColumn="0" w:noHBand="0" w:noVBand="0"/>
       </w:tblPr>
       <w:tblGrid>
         <w:gridCol w:w="4896"/>
@@ -46,188 +48,30 @@
         <w:gridCol w:w="4032"/>
       </w:tblGrid>
       <w:tr>
-        <w:trPr>
-          <w:cantSplit/>
-        </w:trPr>
         <w:tc>
           <w:tcPr>
             <w:tcW w:w="4896" w:type="dxa"/>
-            <w:vAlign w:val="top"/>
           </w:tcPr>
           <w:p>
             <w:pPr>
-              <w:pStyle w:val="SingleSpaced"/>
+              <w:spacing w:before="0" w:after="0" w:line="276" w:lineRule="exact"/>
+              <w:ind w:left="0" w:firstLine="0"/>
+              <w:jc w:val="left"/>
             </w:pPr>
             <w:r>
               <w:t xml:space="preserve">In re:</w:t>
-            </w:r>
-          </w:p>
-          <w:p>
-            <w:pPr>
-              <w:pStyle w:val="SingleSpaced"/>
-            </w:pPr>
-            <w:r>
-              <w:t xml:space="preserve">Bourbon Street LLC,</w:t>
-            </w:r>
-          </w:p>
-          <w:p>
-            <w:pPr>
-              <w:pStyle w:val="SingleSpaced"/>
-            </w:pPr>
-            <w:r>
-              <w:t xml:space="preserve">d/b/a La Cantina, et al.</w:t>
-            </w:r>
-          </w:p>
-          <w:p>
-            <w:pPr>
-              <w:pStyle w:val="SingleSpaced"/>
-              <w:ind w:left="720"/>
-            </w:pPr>
-            <w:r>
-              <w:t xml:space="preserve">Debtors, Jointly Administered.</w:t>
-            </w:r>
-          </w:p>
-          <w:p>
-            <w:pPr>
-              <w:pStyle w:val="SingleSpaced"/>
-            </w:pPr>
-          </w:p>
-          <w:p>
-            <w:pPr>
-              <w:pStyle w:val="SingleSpaced"/>
-            </w:pPr>
-            <w:r>
-              <w:t xml:space="preserve">Bourbon Street LLC</w:t>
-            </w:r>
-          </w:p>
-          <w:p>
-            <w:pPr>
-              <w:pStyle w:val="SingleSpaced"/>
-              <w:ind w:left="720"/>
-            </w:pPr>
-            <w:r>
-              <w:t xml:space="preserve">Plaintiff,</w:t>
-            </w:r>
-          </w:p>
-          <w:p>
-            <w:pPr>
-              <w:pStyle w:val="SingleSpaced"/>
-            </w:pPr>
-            <w:r>
-              <w:t xml:space="preserve">v.</w:t>
-            </w:r>
-          </w:p>
-          <w:p>
-            <w:pPr>
-              <w:pStyle w:val="SingleSpaced"/>
-            </w:pPr>
-          </w:p>
-          <w:p>
-            <w:pPr>
-              <w:pStyle w:val="SingleSpaced"/>
-            </w:pPr>
-            <w:r>
-              <w:t xml:space="preserve">Byzfunder NY LLC d/b/a Byzfunder</w:t>
-            </w:r>
-          </w:p>
-          <w:p>
-            <w:pPr>
-              <w:pStyle w:val="SingleSpaced"/>
-              <w:ind w:left="720"/>
-            </w:pPr>
-            <w:r>
-              <w:t xml:space="preserve">Defendant.</w:t>
             </w:r>
           </w:p>
         </w:tc>
         <w:tc>
           <w:tcPr>
             <w:tcW w:w="432" w:type="dxa"/>
-            <w:vAlign w:val="top"/>
           </w:tcPr>
           <w:p>
             <w:pPr>
-              <w:pStyle w:val="SingleSpaced"/>
-            </w:pPr>
-            <w:r>
-              <w:t xml:space="preserve">)</w:t>
-            </w:r>
-          </w:p>
-          <w:p>
-            <w:pPr>
-              <w:pStyle w:val="SingleSpaced"/>
-            </w:pPr>
-            <w:r>
-              <w:t xml:space="preserve">)</w:t>
-            </w:r>
-          </w:p>
-          <w:p>
-            <w:pPr>
-              <w:pStyle w:val="SingleSpaced"/>
-            </w:pPr>
-            <w:r>
-              <w:t xml:space="preserve">)</w:t>
-            </w:r>
-          </w:p>
-          <w:p>
-            <w:pPr>
-              <w:pStyle w:val="SingleSpaced"/>
-            </w:pPr>
-            <w:r>
-              <w:t xml:space="preserve">)</w:t>
-            </w:r>
-          </w:p>
-          <w:p>
-            <w:pPr>
-              <w:pStyle w:val="SingleSpaced"/>
-            </w:pPr>
-            <w:r>
-              <w:t xml:space="preserve">)</w:t>
-            </w:r>
-          </w:p>
-          <w:p>
-            <w:pPr>
-              <w:pStyle w:val="SingleSpaced"/>
-            </w:pPr>
-            <w:r>
-              <w:t xml:space="preserve">)</w:t>
-            </w:r>
-          </w:p>
-          <w:p>
-            <w:pPr>
-              <w:pStyle w:val="SingleSpaced"/>
-            </w:pPr>
-            <w:r>
-              <w:t xml:space="preserve">)</w:t>
-            </w:r>
-          </w:p>
-          <w:p>
-            <w:pPr>
-              <w:pStyle w:val="SingleSpaced"/>
-            </w:pPr>
-            <w:r>
-              <w:t xml:space="preserve">)</w:t>
-            </w:r>
-          </w:p>
-          <w:p>
-            <w:pPr>
-              <w:pStyle w:val="SingleSpaced"/>
-            </w:pPr>
-            <w:r>
-              <w:t xml:space="preserve">)</w:t>
-            </w:r>
-          </w:p>
-          <w:p>
-            <w:pPr>
-              <w:pStyle w:val="SingleSpaced"/>
-            </w:pPr>
-            <w:r>
-              <w:t xml:space="preserve">)</w:t>
-            </w:r>
-          </w:p>
-          <w:p>
-            <w:pPr>
-              <w:pStyle w:val="SingleSpaced"/>
+              <w:spacing w:before="0" w:after="0" w:line="276" w:lineRule="exact"/>
+              <w:ind w:left="0" w:firstLine="0"/>
+              <w:jc w:val="center"/>
             </w:pPr>
             <w:r>
               <w:t xml:space="preserve">)</w:t>
@@ -237,50 +81,477 @@
         <w:tc>
           <w:tcPr>
             <w:tcW w:w="4032" w:type="dxa"/>
-            <w:vAlign w:val="center"/>
           </w:tcPr>
           <w:p>
             <w:pPr>
-              <w:pStyle w:val="SingleSpaced"/>
-            </w:pPr>
-            <w:r>
-              <w:t xml:space="preserve">Case No. 23-30246</w:t>
-            </w:r>
-          </w:p>
-          <w:p>
-            <w:pPr>
-              <w:pStyle w:val="SingleSpaced"/>
+              <w:spacing w:before="0" w:after="0" w:line="276" w:lineRule="exact"/>
+              <w:ind w:left="0" w:firstLine="0"/>
+              <w:jc w:val="left"/>
+            </w:pPr>
+          </w:p>
+        </w:tc>
+      </w:tr>
+      <w:tr>
+        <w:tc>
+          <w:tcPr>
+            <w:tcW w:w="4896" w:type="dxa"/>
+          </w:tcPr>
+          <w:p>
+            <w:pPr>
+              <w:spacing w:before="0" w:after="0" w:line="276" w:lineRule="exact"/>
+              <w:ind w:left="0" w:firstLine="0"/>
+              <w:jc w:val="left"/>
+            </w:pPr>
+            <w:r>
+              <w:t xml:space="preserve">Bourbon Street LLC,</w:t>
+            </w:r>
+          </w:p>
+        </w:tc>
+        <w:tc>
+          <w:tcPr>
+            <w:tcW w:w="432" w:type="dxa"/>
+          </w:tcPr>
+          <w:p>
+            <w:pPr>
+              <w:spacing w:before="0" w:after="0" w:line="276" w:lineRule="exact"/>
+              <w:ind w:left="0" w:firstLine="0"/>
+              <w:jc w:val="center"/>
+            </w:pPr>
+            <w:r>
+              <w:t xml:space="preserve">)</w:t>
+            </w:r>
+          </w:p>
+        </w:tc>
+        <w:tc>
+          <w:tcPr>
+            <w:tcW w:w="4032" w:type="dxa"/>
+          </w:tcPr>
+          <w:p>
+            <w:pPr>
+              <w:spacing w:before="0" w:after="0" w:line="276" w:lineRule="exact"/>
+              <w:ind w:left="0" w:firstLine="0"/>
+              <w:jc w:val="left"/>
+            </w:pPr>
+            <w:r>
+              <w:t xml:space="preserve">Case No. 23</w:t>
+              <w:noBreakHyphen/>
+              <w:t xml:space="preserve">30246</w:t>
+            </w:r>
+          </w:p>
+        </w:tc>
+      </w:tr>
+      <w:tr>
+        <w:tc>
+          <w:tcPr>
+            <w:tcW w:w="4896" w:type="dxa"/>
+          </w:tcPr>
+          <w:p>
+            <w:pPr>
+              <w:spacing w:before="0" w:after="0" w:line="276" w:lineRule="exact"/>
+              <w:ind w:left="0" w:firstLine="0"/>
+              <w:jc w:val="left"/>
+            </w:pPr>
+            <w:r>
+              <w:t xml:space="preserve">d/b/a La Cantina, et al.</w:t>
+            </w:r>
+          </w:p>
+        </w:tc>
+        <w:tc>
+          <w:tcPr>
+            <w:tcW w:w="432" w:type="dxa"/>
+          </w:tcPr>
+          <w:p>
+            <w:pPr>
+              <w:spacing w:before="0" w:after="0" w:line="276" w:lineRule="exact"/>
+              <w:ind w:left="0" w:firstLine="0"/>
+              <w:jc w:val="center"/>
+            </w:pPr>
+            <w:r>
+              <w:t xml:space="preserve">)</w:t>
+            </w:r>
+          </w:p>
+        </w:tc>
+        <w:tc>
+          <w:tcPr>
+            <w:tcW w:w="4032" w:type="dxa"/>
+          </w:tcPr>
+          <w:p>
+            <w:pPr>
+              <w:spacing w:before="0" w:after="0" w:line="276" w:lineRule="exact"/>
+              <w:ind w:left="0" w:firstLine="0"/>
+              <w:jc w:val="left"/>
             </w:pPr>
             <w:r>
               <w:t xml:space="preserve">Chapter 11 – Subchapter V</w:t>
             </w:r>
           </w:p>
-          <w:p>
-            <w:pPr>
-              <w:pStyle w:val="SingleSpaced"/>
-            </w:pPr>
-          </w:p>
-          <w:p>
-            <w:pPr>
-              <w:pStyle w:val="SingleSpaced"/>
-            </w:pPr>
-            <w:r>
-              <w:t xml:space="preserve">Adversary No. 23-07012</w:t>
-            </w:r>
+        </w:tc>
+      </w:tr>
+      <w:tr>
+        <w:tc>
+          <w:tcPr>
+            <w:tcW w:w="4896" w:type="dxa"/>
+          </w:tcPr>
+          <w:p>
+            <w:pPr>
+              <w:spacing w:before="0" w:after="0" w:line="276" w:lineRule="exact"/>
+              <w:ind w:left="720" w:firstLine="0"/>
+              <w:jc w:val="left"/>
+            </w:pPr>
+            <w:r>
+              <w:t xml:space="preserve">Debtors, Jointly Administered.</w:t>
+            </w:r>
+          </w:p>
+        </w:tc>
+        <w:tc>
+          <w:tcPr>
+            <w:tcW w:w="432" w:type="dxa"/>
+          </w:tcPr>
+          <w:p>
+            <w:pPr>
+              <w:spacing w:before="0" w:after="0" w:line="276" w:lineRule="exact"/>
+              <w:ind w:left="0" w:firstLine="0"/>
+              <w:jc w:val="center"/>
+            </w:pPr>
+            <w:r>
+              <w:t xml:space="preserve">)</w:t>
+            </w:r>
+          </w:p>
+        </w:tc>
+        <w:tc>
+          <w:tcPr>
+            <w:tcW w:w="4032" w:type="dxa"/>
+          </w:tcPr>
+          <w:p>
+            <w:pPr>
+              <w:spacing w:before="0" w:after="0" w:line="276" w:lineRule="exact"/>
+              <w:ind w:left="0" w:firstLine="0"/>
+              <w:jc w:val="left"/>
+            </w:pPr>
+          </w:p>
+        </w:tc>
+      </w:tr>
+      <w:tr>
+        <w:tc>
+          <w:tcPr>
+            <w:tcW w:w="4896" w:type="dxa"/>
+          </w:tcPr>
+          <w:p>
+            <w:pPr>
+              <w:spacing w:before="0" w:after="0" w:line="276" w:lineRule="exact"/>
+              <w:ind w:left="0" w:firstLine="0"/>
+              <w:jc w:val="left"/>
+            </w:pPr>
+          </w:p>
+        </w:tc>
+        <w:tc>
+          <w:tcPr>
+            <w:tcW w:w="432" w:type="dxa"/>
+          </w:tcPr>
+          <w:p>
+            <w:pPr>
+              <w:spacing w:before="0" w:after="0" w:line="276" w:lineRule="exact"/>
+              <w:ind w:left="0" w:firstLine="0"/>
+              <w:jc w:val="center"/>
+            </w:pPr>
+            <w:r>
+              <w:t xml:space="preserve">)</w:t>
+            </w:r>
+          </w:p>
+        </w:tc>
+        <w:tc>
+          <w:tcPr>
+            <w:tcW w:w="4032" w:type="dxa"/>
+          </w:tcPr>
+          <w:p>
+            <w:pPr>
+              <w:spacing w:before="0" w:after="0" w:line="276" w:lineRule="exact"/>
+              <w:ind w:left="0" w:firstLine="0"/>
+              <w:jc w:val="left"/>
+            </w:pPr>
+          </w:p>
+        </w:tc>
+      </w:tr>
+      <w:tr>
+        <w:tc>
+          <w:tcPr>
+            <w:tcW w:w="4896" w:type="dxa"/>
+          </w:tcPr>
+          <w:p>
+            <w:pPr>
+              <w:spacing w:before="0" w:after="0" w:line="276" w:lineRule="exact"/>
+              <w:ind w:left="0" w:firstLine="0"/>
+              <w:jc w:val="left"/>
+            </w:pPr>
+            <w:r>
+              <w:t xml:space="preserve">Bourbon Street LLC</w:t>
+            </w:r>
+          </w:p>
+        </w:tc>
+        <w:tc>
+          <w:tcPr>
+            <w:tcW w:w="432" w:type="dxa"/>
+          </w:tcPr>
+          <w:p>
+            <w:pPr>
+              <w:spacing w:before="0" w:after="0" w:line="276" w:lineRule="exact"/>
+              <w:ind w:left="0" w:firstLine="0"/>
+              <w:jc w:val="center"/>
+            </w:pPr>
+            <w:r>
+              <w:t xml:space="preserve">)</w:t>
+            </w:r>
+          </w:p>
+        </w:tc>
+        <w:tc>
+          <w:tcPr>
+            <w:tcW w:w="4032" w:type="dxa"/>
+          </w:tcPr>
+          <w:p>
+            <w:pPr>
+              <w:spacing w:before="0" w:after="0" w:line="276" w:lineRule="exact"/>
+              <w:ind w:left="0" w:firstLine="0"/>
+              <w:jc w:val="left"/>
+            </w:pPr>
+            <w:r>
+              <w:t xml:space="preserve">Adversary No. 23</w:t>
+              <w:noBreakHyphen/>
+              <w:t xml:space="preserve">07012</w:t>
+            </w:r>
+          </w:p>
+        </w:tc>
+      </w:tr>
+      <w:tr>
+        <w:tc>
+          <w:tcPr>
+            <w:tcW w:w="4896" w:type="dxa"/>
+          </w:tcPr>
+          <w:p>
+            <w:pPr>
+              <w:spacing w:before="0" w:after="0" w:line="276" w:lineRule="exact"/>
+              <w:ind w:left="720" w:firstLine="0"/>
+              <w:jc w:val="left"/>
+            </w:pPr>
+            <w:r>
+              <w:t xml:space="preserve">Plaintiff,</w:t>
+            </w:r>
+          </w:p>
+        </w:tc>
+        <w:tc>
+          <w:tcPr>
+            <w:tcW w:w="432" w:type="dxa"/>
+          </w:tcPr>
+          <w:p>
+            <w:pPr>
+              <w:spacing w:before="0" w:after="0" w:line="276" w:lineRule="exact"/>
+              <w:ind w:left="0" w:firstLine="0"/>
+              <w:jc w:val="center"/>
+            </w:pPr>
+            <w:r>
+              <w:t xml:space="preserve">)</w:t>
+            </w:r>
+          </w:p>
+        </w:tc>
+        <w:tc>
+          <w:tcPr>
+            <w:tcW w:w="4032" w:type="dxa"/>
+          </w:tcPr>
+          <w:p>
+            <w:pPr>
+              <w:spacing w:before="0" w:after="0" w:line="276" w:lineRule="exact"/>
+              <w:ind w:left="0" w:firstLine="0"/>
+              <w:jc w:val="left"/>
+            </w:pPr>
+          </w:p>
+        </w:tc>
+      </w:tr>
+      <w:tr>
+        <w:tc>
+          <w:tcPr>
+            <w:tcW w:w="4896" w:type="dxa"/>
+          </w:tcPr>
+          <w:p>
+            <w:pPr>
+              <w:spacing w:before="0" w:after="0" w:line="276" w:lineRule="exact"/>
+              <w:ind w:left="0" w:firstLine="0"/>
+              <w:jc w:val="left"/>
+            </w:pPr>
+            <w:r>
+              <w:t xml:space="preserve">v.</w:t>
+            </w:r>
+          </w:p>
+        </w:tc>
+        <w:tc>
+          <w:tcPr>
+            <w:tcW w:w="432" w:type="dxa"/>
+          </w:tcPr>
+          <w:p>
+            <w:pPr>
+              <w:spacing w:before="0" w:after="0" w:line="276" w:lineRule="exact"/>
+              <w:ind w:left="0" w:firstLine="0"/>
+              <w:jc w:val="center"/>
+            </w:pPr>
+            <w:r>
+              <w:t xml:space="preserve">)</w:t>
+            </w:r>
+          </w:p>
+        </w:tc>
+        <w:tc>
+          <w:tcPr>
+            <w:tcW w:w="4032" w:type="dxa"/>
+          </w:tcPr>
+          <w:p>
+            <w:pPr>
+              <w:spacing w:before="0" w:after="0" w:line="276" w:lineRule="exact"/>
+              <w:ind w:left="0" w:firstLine="0"/>
+              <w:jc w:val="left"/>
+            </w:pPr>
+          </w:p>
+        </w:tc>
+      </w:tr>
+      <w:tr>
+        <w:tc>
+          <w:tcPr>
+            <w:tcW w:w="4896" w:type="dxa"/>
+          </w:tcPr>
+          <w:p>
+            <w:pPr>
+              <w:spacing w:before="0" w:after="0" w:line="276" w:lineRule="exact"/>
+              <w:ind w:left="0" w:firstLine="0"/>
+              <w:jc w:val="left"/>
+            </w:pPr>
+          </w:p>
+        </w:tc>
+        <w:tc>
+          <w:tcPr>
+            <w:tcW w:w="432" w:type="dxa"/>
+          </w:tcPr>
+          <w:p>
+            <w:pPr>
+              <w:spacing w:before="0" w:after="0" w:line="276" w:lineRule="exact"/>
+              <w:ind w:left="0" w:firstLine="0"/>
+              <w:jc w:val="center"/>
+            </w:pPr>
+            <w:r>
+              <w:t xml:space="preserve">)</w:t>
+            </w:r>
+          </w:p>
+        </w:tc>
+        <w:tc>
+          <w:tcPr>
+            <w:tcW w:w="4032" w:type="dxa"/>
+          </w:tcPr>
+          <w:p>
+            <w:pPr>
+              <w:spacing w:before="0" w:after="0" w:line="276" w:lineRule="exact"/>
+              <w:ind w:left="0" w:firstLine="0"/>
+              <w:jc w:val="left"/>
+            </w:pPr>
+          </w:p>
+        </w:tc>
+      </w:tr>
+      <w:tr>
+        <w:tc>
+          <w:tcPr>
+            <w:tcW w:w="4896" w:type="dxa"/>
+          </w:tcPr>
+          <w:p>
+            <w:pPr>
+              <w:spacing w:before="0" w:after="0" w:line="276" w:lineRule="exact"/>
+              <w:ind w:left="0" w:firstLine="0"/>
+              <w:jc w:val="left"/>
+            </w:pPr>
+            <w:r>
+              <w:t xml:space="preserve">Byzfunder NY LLC d/b/a Byzfunder</w:t>
+            </w:r>
+          </w:p>
+        </w:tc>
+        <w:tc>
+          <w:tcPr>
+            <w:tcW w:w="432" w:type="dxa"/>
+          </w:tcPr>
+          <w:p>
+            <w:pPr>
+              <w:spacing w:before="0" w:after="0" w:line="276" w:lineRule="exact"/>
+              <w:ind w:left="0" w:firstLine="0"/>
+              <w:jc w:val="center"/>
+            </w:pPr>
+            <w:r>
+              <w:t xml:space="preserve">)</w:t>
+            </w:r>
+          </w:p>
+        </w:tc>
+        <w:tc>
+          <w:tcPr>
+            <w:tcW w:w="4032" w:type="dxa"/>
+          </w:tcPr>
+          <w:p>
+            <w:pPr>
+              <w:spacing w:before="0" w:after="0" w:line="276" w:lineRule="exact"/>
+              <w:ind w:left="0" w:firstLine="0"/>
+              <w:jc w:val="left"/>
+            </w:pPr>
+          </w:p>
+        </w:tc>
+      </w:tr>
+      <w:tr>
+        <w:tc>
+          <w:tcPr>
+            <w:tcW w:w="4896" w:type="dxa"/>
+          </w:tcPr>
+          <w:p>
+            <w:pPr>
+              <w:spacing w:before="0" w:after="0" w:line="276" w:lineRule="exact"/>
+              <w:ind w:left="720" w:firstLine="0"/>
+              <w:jc w:val="left"/>
+            </w:pPr>
+            <w:r>
+              <w:t xml:space="preserve">Defendant.</w:t>
+            </w:r>
+          </w:p>
+        </w:tc>
+        <w:tc>
+          <w:tcPr>
+            <w:tcW w:w="432" w:type="dxa"/>
+          </w:tcPr>
+          <w:p>
+            <w:pPr>
+              <w:spacing w:before="0" w:after="0" w:line="276" w:lineRule="exact"/>
+              <w:ind w:left="0" w:firstLine="0"/>
+              <w:jc w:val="center"/>
+            </w:pPr>
+            <w:r>
+              <w:t xml:space="preserve">)</w:t>
+            </w:r>
+          </w:p>
+        </w:tc>
+        <w:tc>
+          <w:tcPr>
+            <w:tcW w:w="4032" w:type="dxa"/>
+          </w:tcPr>
+          <w:p>
+            <w:pPr>
+              <w:spacing w:before="0" w:after="0" w:line="276" w:lineRule="exact"/>
+              <w:ind w:left="0" w:firstLine="0"/>
+              <w:jc w:val="left"/>
+            </w:pPr>
           </w:p>
         </w:tc>
       </w:tr>
     </w:tbl>
     <w:p>
       <w:pPr>
-        <w:pStyle w:val="BodyText"/>
-      </w:pPr>
-    </w:p>
-    <w:p>
-      <w:pPr>
-        <w:pStyle w:val="TitleLine"/>
-      </w:pPr>
-      <w:r>
+        <w:keepNext/>
+        <w:keepLines/>
+        <w:spacing w:before="552" w:after="276" w:line="276" w:lineRule="exact"/>
+        <w:ind w:left="0" w:firstLine="0"/>
+        <w:jc w:val="center"/>
+      </w:pPr>
+      <w:r>
+        <w:rPr>
+          <w:b/>
+          <w:bCs/>
+        </w:rPr>
         <w:t xml:space="preserve">COMPLAINT</w:t>
       </w:r>
     </w:p>
@@ -288,27 +559,31 @@
       <w:pPr>
         <w:pStyle w:val="BodyText"/>
       </w:pPr>
-    </w:p>
-    <w:p>
-      <w:pPr>
-        <w:pStyle w:val="NumberedParagraph"/>
-      </w:pPr>
-      <w:r>
-        <w:t xml:space="preserve">Comes now Bourbon Street LLC (“Bourbon Street” or the “Debtor”), by and through undersigned counsel, pursuant to Federal Rule of Bankruptcy Procedure 7003 and Federal Rule of Civil Procedure 3, and as and for its complaint (the “Complaint”) against Byzfunder NY LLC d/b/a Byzfunder (“BNL” or the “Defendant”) states as follows:</w:t>
-      </w:r>
-    </w:p>
-    <w:bookmarkStart w:id="20" w:name="introduction"/>
+      <w:r>
+        <w:t xml:space="preserve">Comes now Bourbon Street LLC (“Bourbon Street” or the “Debtor”), by and through undersigned counsel, pursuant to Federal Rule of Bankruptcy Procedure 7003 and Federal Rule of Civil Procedure 3, and as and for its complaint (the “Complaint”) against Byzfunder NY LLC d/​b/​a Byzfunder (“BNL” or the “Defendant”) states as follows:</w:t>
+      </w:r>
+    </w:p>
     <w:p>
       <w:pPr>
         <w:pStyle w:val="Heading2"/>
-      </w:pPr>
-      <w:r>
+        <w:keepNext/>
+        <w:keepLines/>
+        <w:spacing w:before="0" w:after="0" w:line="552" w:lineRule="exact"/>
+        <w:ind w:left="0" w:firstLine="0"/>
+        <w:jc w:val="center"/>
+      </w:pPr>
+      <w:r>
+        <w:rPr>
+          <w:b/>
+          <w:bCs/>
+          <w:caps w:val="0"/>
+        </w:rPr>
         <w:t xml:space="preserve">Introduction</w:t>
       </w:r>
     </w:p>
     <w:p>
       <w:pPr>
-        <w:pStyle w:val="NumberedParagraph"/>
+        <w:pStyle w:val="BodyText"/>
       </w:pPr>
       <w:r>
         <w:t xml:space="preserve">1.</w:t>
@@ -322,7 +597,7 @@
     </w:p>
     <w:p>
       <w:pPr>
-        <w:pStyle w:val="NumberedParagraph"/>
+        <w:pStyle w:val="BodyText"/>
       </w:pPr>
       <w:r>
         <w:t xml:space="preserve">2.</w:t>
@@ -336,7 +611,7 @@
     </w:p>
     <w:p>
       <w:pPr>
-        <w:pStyle w:val="NumberedParagraph"/>
+        <w:pStyle w:val="BodyText"/>
       </w:pPr>
       <w:r>
         <w:t xml:space="preserve">3.</w:t>
@@ -350,7 +625,7 @@
     </w:p>
     <w:p>
       <w:pPr>
-        <w:pStyle w:val="NumberedParagraph"/>
+        <w:pStyle w:val="BodyText"/>
       </w:pPr>
       <w:r>
         <w:t xml:space="preserve">4.</w:t>
@@ -364,7 +639,7 @@
     </w:p>
     <w:p>
       <w:pPr>
-        <w:pStyle w:val="NumberedParagraph"/>
+        <w:pStyle w:val="BodyText"/>
       </w:pPr>
       <w:r>
         <w:t xml:space="preserve">5.</w:t>
@@ -378,7 +653,7 @@
     </w:p>
     <w:p>
       <w:pPr>
-        <w:pStyle w:val="NumberedParagraph"/>
+        <w:pStyle w:val="BodyText"/>
       </w:pPr>
       <w:r>
         <w:t xml:space="preserve">6.</w:t>
@@ -392,7 +667,7 @@
     </w:p>
     <w:p>
       <w:pPr>
-        <w:pStyle w:val="NumberedParagraph"/>
+        <w:pStyle w:val="BodyText"/>
       </w:pPr>
       <w:r>
         <w:t xml:space="preserve">7.</w:t>
@@ -406,7 +681,7 @@
     </w:p>
     <w:p>
       <w:pPr>
-        <w:pStyle w:val="NumberedParagraph"/>
+        <w:pStyle w:val="BodyText"/>
       </w:pPr>
       <w:r>
         <w:t xml:space="preserve">8.</w:t>
@@ -418,19 +693,27 @@
         <w:t xml:space="preserve">To be sure, another ill is afoot sub judice: BNL appears to have run roughshod over the automatic stay set forth in Section 362 of Title 11 of the United States Code, endeavoring to garnish Bourbon Street’s credit card processor post-petition. But at core, this suit is intended to follow in the steps of the adversary complaint filed by Gannett Peak, LLC against another MCA operator, transparently aiming to reveal the predatory nature of the MCA industry while also having the underlying transaction properly deemed a fraudulent conveyance avoidable under both state and federal law.</w:t>
       </w:r>
     </w:p>
-    <w:bookmarkEnd w:id="20"/>
-    <w:bookmarkStart w:id="21" w:name="parties"/>
     <w:p>
       <w:pPr>
         <w:pStyle w:val="Heading2"/>
-      </w:pPr>
-      <w:r>
+        <w:keepNext/>
+        <w:keepLines/>
+        <w:spacing w:before="0" w:after="0" w:line="552" w:lineRule="exact"/>
+        <w:ind w:left="0" w:firstLine="0"/>
+        <w:jc w:val="center"/>
+      </w:pPr>
+      <w:r>
+        <w:rPr>
+          <w:b/>
+          <w:bCs/>
+          <w:caps w:val="0"/>
+        </w:rPr>
         <w:t xml:space="preserve">Parties</w:t>
       </w:r>
     </w:p>
     <w:p>
       <w:pPr>
-        <w:pStyle w:val="NumberedParagraph"/>
+        <w:pStyle w:val="BodyText"/>
       </w:pPr>
       <w:r>
         <w:t xml:space="preserve">9.</w:t>
@@ -444,7 +727,7 @@
     </w:p>
     <w:p>
       <w:pPr>
-        <w:pStyle w:val="NumberedParagraph"/>
+        <w:pStyle w:val="BodyText"/>
       </w:pPr>
       <w:r>
         <w:t xml:space="preserve">10.</w:t>
@@ -458,7 +741,7 @@
     </w:p>
     <w:p>
       <w:pPr>
-        <w:pStyle w:val="NumberedParagraph"/>
+        <w:pStyle w:val="BodyText"/>
       </w:pPr>
       <w:r>
         <w:t xml:space="preserve">11.</w:t>
@@ -470,19 +753,59 @@
         <w:t xml:space="preserve">BNL is not registered to conduct business in the State of North Dakota.</w:t>
       </w:r>
     </w:p>
-    <w:bookmarkEnd w:id="21"/>
-    <w:bookmarkStart w:id="22" w:name="jurisdiction-and-venue"/>
     <w:p>
       <w:pPr>
         <w:pStyle w:val="Heading2"/>
-      </w:pPr>
-      <w:r>
-        <w:t xml:space="preserve">Jurisdiction and Venue</w:t>
-      </w:r>
-    </w:p>
-    <w:p>
-      <w:pPr>
-        <w:pStyle w:val="NumberedParagraph"/>
+        <w:keepNext/>
+        <w:keepLines/>
+        <w:spacing w:before="0" w:after="0" w:line="552" w:lineRule="exact"/>
+        <w:ind w:left="0" w:firstLine="0"/>
+        <w:jc w:val="center"/>
+      </w:pPr>
+      <w:r>
+        <w:rPr>
+          <w:b/>
+          <w:bCs/>
+          <w:caps w:val="0"/>
+        </w:rPr>
+        <w:t xml:space="preserve">Jurisdiction</w:t>
+      </w:r>
+      <w:r>
+        <w:rPr>
+          <w:b/>
+          <w:bCs/>
+          <w:caps w:val="0"/>
+        </w:rPr>
+        <w:t xml:space="preserve"> </w:t>
+      </w:r>
+      <w:r>
+        <w:rPr>
+          <w:b/>
+          <w:bCs/>
+          <w:caps w:val="0"/>
+        </w:rPr>
+        <w:t xml:space="preserve">and</w:t>
+      </w:r>
+      <w:r>
+        <w:rPr>
+          <w:b/>
+          <w:bCs/>
+          <w:caps w:val="0"/>
+        </w:rPr>
+        <w:t xml:space="preserve"> </w:t>
+      </w:r>
+      <w:r>
+        <w:rPr>
+          <w:b/>
+          <w:bCs/>
+          <w:caps w:val="0"/>
+        </w:rPr>
+        <w:t xml:space="preserve">Venue</w:t>
+      </w:r>
+    </w:p>
+    <w:p>
+      <w:pPr>
+        <w:pStyle w:val="BodyText"/>
       </w:pPr>
       <w:r>
         <w:t xml:space="preserve">12.</w:t>
@@ -491,12 +814,12 @@
         <w:tab/>
       </w:r>
       <w:r>
-        <w:t xml:space="preserve">This Honorable Court enjoys jurisdiction over the instant proceeding, pursuant to the allowances of Section 157(b)(2)(A, H, O) of Title 28 of the United States Code, as this case concerns the administration of the Debtor’s estate, an effort to recover a fraudulent conveyance, and the adjustment of the debtor-creditor relationship.</w:t>
-      </w:r>
-    </w:p>
-    <w:p>
-      <w:pPr>
-        <w:pStyle w:val="NumberedParagraph"/>
+        <w:t xml:space="preserve">This Honorable Court enjoys jurisdiction over the instant proceeding, pursuant to the allowances of Section 157(b)⁠(2)⁠(A, H, O) of Title 28 of the United States Code, as this case concerns the administration of the Debtor’s estate, an effort to recover a fraudulent conveyance, and the adjustment of the debtor-creditor relationship.</w:t>
+      </w:r>
+    </w:p>
+    <w:p>
+      <w:pPr>
+        <w:pStyle w:val="BodyText"/>
       </w:pPr>
       <w:r>
         <w:t xml:space="preserve">13.</w:t>
@@ -508,19 +831,43 @@
         <w:t xml:space="preserve">Venue is properly laid in this Honorable Court pursuant to the allowances of Section 1334 of Title 28 of the United States Code, as this matter relates to a proceeding under Title 11 of the United States Code.</w:t>
       </w:r>
     </w:p>
-    <w:bookmarkEnd w:id="22"/>
-    <w:bookmarkStart w:id="23" w:name="general-allegations"/>
     <w:p>
       <w:pPr>
         <w:pStyle w:val="Heading2"/>
-      </w:pPr>
-      <w:r>
-        <w:t xml:space="preserve">General Allegations</w:t>
-      </w:r>
-    </w:p>
-    <w:p>
-      <w:pPr>
-        <w:pStyle w:val="NumberedParagraph"/>
+        <w:keepNext/>
+        <w:keepLines/>
+        <w:spacing w:before="0" w:after="0" w:line="552" w:lineRule="exact"/>
+        <w:ind w:left="0" w:firstLine="0"/>
+        <w:jc w:val="center"/>
+      </w:pPr>
+      <w:r>
+        <w:rPr>
+          <w:b/>
+          <w:bCs/>
+          <w:caps w:val="0"/>
+        </w:rPr>
+        <w:t xml:space="preserve">General</w:t>
+      </w:r>
+      <w:r>
+        <w:rPr>
+          <w:b/>
+          <w:bCs/>
+          <w:caps w:val="0"/>
+        </w:rPr>
+        <w:t xml:space="preserve"> </w:t>
+      </w:r>
+      <w:r>
+        <w:rPr>
+          <w:b/>
+          <w:bCs/>
+          <w:caps w:val="0"/>
+        </w:rPr>
+        <w:t xml:space="preserve">Allegations</w:t>
+      </w:r>
+    </w:p>
+    <w:p>
+      <w:pPr>
+        <w:pStyle w:val="BodyText"/>
       </w:pPr>
       <w:r>
         <w:t xml:space="preserve">14.</w:t>
@@ -534,7 +881,7 @@
     </w:p>
     <w:p>
       <w:pPr>
-        <w:pStyle w:val="NumberedParagraph"/>
+        <w:pStyle w:val="BodyText"/>
       </w:pPr>
       <w:r>
         <w:t xml:space="preserve">15.</w:t>
@@ -548,7 +895,7 @@
     </w:p>
     <w:p>
       <w:pPr>
-        <w:pStyle w:val="NumberedParagraph"/>
+        <w:pStyle w:val="BodyText"/>
       </w:pPr>
       <w:r>
         <w:t xml:space="preserve">16.</w:t>
@@ -557,12 +904,12 @@
         <w:tab/>
       </w:r>
       <w:r>
-        <w:t xml:space="preserve">Per the Agreement, BNL is to fund $28,825.00 to Bourbon Street, see Agreement, Exhibit A, at p. 1, in exchange for Bourbon Street diverting $41,100.00 in future receivables to BNL through payments of $1,284.38 per week, id.</w:t>
-      </w:r>
-    </w:p>
-    <w:p>
-      <w:pPr>
-        <w:pStyle w:val="NumberedParagraph"/>
+        <w:t xml:space="preserve">Per the Agreement, BNL is to fund $28,825.00 to Bourbon Street, see Agreement, Exhibit A, at p. 1, in exchange for Bourbon Street diverting $41,100.00 in future receivables to BNL through payments of $1,284.38 per week, id.</w:t>
+      </w:r>
+    </w:p>
+    <w:p>
+      <w:pPr>
+        <w:pStyle w:val="BodyText"/>
       </w:pPr>
       <w:r>
         <w:t xml:space="preserve">17.</w:t>
@@ -571,12 +918,12 @@
         <w:tab/>
       </w:r>
       <w:r>
-        <w:t xml:space="preserve">The Agreement was drafted by BNL and, in addition to proclaiming the transaction to not be a loan in the manner referenced supra, provides, inter alia, “Merchant and [BNL] agree that the Purchase Price under this Agreement is in exchange for the Purchased Amount, and that such Purchase Price is not intended to be, nor shall it be construed as a loan from [BNL] to Merchant. Merchant agrees that the Purchase Price is in exchange for the Receipts pursuant to this Agreement, and that it equals the fair market value of such Receipts.” Id. at p. 2, § 1.5.</w:t>
-      </w:r>
-    </w:p>
-    <w:p>
-      <w:pPr>
-        <w:pStyle w:val="NumberedParagraph"/>
+        <w:t xml:space="preserve">The Agreement was drafted by BNL and, in addition to proclaiming the transaction to not be a loan in the manner referenced supra, provides, inter alia, “Merchant and [BNL] agree that the Purchase Price under this Agreement is in exchange for the Purchased Amount, and that such Purchase Price is not intended to be, nor shall it be construed as a loan from [BNL] to Merchant. Merchant agrees that the Purchase Price is in exchange for the Receipts pursuant to this Agreement, and that it equals the fair market value of such Receipts.” Id. at p. 2, § 1.5.</w:t>
+      </w:r>
+    </w:p>
+    <w:p>
+      <w:pPr>
+        <w:pStyle w:val="BodyText"/>
       </w:pPr>
       <w:r>
         <w:t xml:space="preserve">18.</w:t>
@@ -585,12 +932,18 @@
         <w:tab/>
       </w:r>
       <w:r>
-        <w:t xml:space="preserve">Despite the repetitive internal denials of lending activity, BNL recorded a UCC-1 lien to secure its claim against Bourbon Street’s various receivables (the “Financing Statement”).</w:t>
-      </w:r>
-    </w:p>
-    <w:p>
-      <w:pPr>
-        <w:pStyle w:val="NumberedParagraph"/>
+        <w:t xml:space="preserve">Despite the repetitive internal denials of lending activity, BNL recorded a UCC</w:t>
+      </w:r>
+      <w:r>
+        <w:noBreakHyphen/>
+      </w:r>
+      <w:r>
+        <w:t xml:space="preserve">1 lien to secure its claim against Bourbon Street’s various receivables (the “Financing Statement”).</w:t>
+      </w:r>
+    </w:p>
+    <w:p>
+      <w:pPr>
+        <w:pStyle w:val="BodyText"/>
       </w:pPr>
       <w:r>
         <w:t xml:space="preserve">19.</w:t>
@@ -599,12 +952,18 @@
         <w:tab/>
       </w:r>
       <w:r>
-        <w:t xml:space="preserve">The Financing Statement is, and at all times has been, ineffective, as the whole of Bourbon Street’s assets are encumbered by an obligation to Choice Financial Group, as memorialized by a UCC-1 lien properly filed before the Agreement was entered into with BNL.</w:t>
-      </w:r>
-    </w:p>
-    <w:p>
-      <w:pPr>
-        <w:pStyle w:val="NumberedParagraph"/>
+        <w:t xml:space="preserve">The Financing Statement is, and at all times has been, ineffective, as the whole of Bourbon Street’s assets are encumbered by an obligation to Choice Financial Group, as memorialized by a UCC</w:t>
+      </w:r>
+      <w:r>
+        <w:noBreakHyphen/>
+      </w:r>
+      <w:r>
+        <w:t xml:space="preserve">1 lien properly filed before the Agreement was entered into with BNL.</w:t>
+      </w:r>
+    </w:p>
+    <w:p>
+      <w:pPr>
+        <w:pStyle w:val="BodyText"/>
       </w:pPr>
       <w:r>
         <w:t xml:space="preserve">20.</w:t>
@@ -618,7 +977,7 @@
     </w:p>
     <w:p>
       <w:pPr>
-        <w:pStyle w:val="NumberedParagraph"/>
+        <w:pStyle w:val="BodyText"/>
       </w:pPr>
       <w:r>
         <w:t xml:space="preserve">21.</w:t>
@@ -627,12 +986,12 @@
         <w:tab/>
       </w:r>
       <w:r>
-        <w:t xml:space="preserve">Notwithstanding its receipt of constructive notice of this case, on or about August 28, 2023, BNL served a garnishment on Shift4 Payments, Inc. (“Shift4”), the credit card processor used by Bourbon Street, in an effort to garnish the whole of Bourbon Street’s credit card sales for a post-petition period of time.</w:t>
-      </w:r>
-    </w:p>
-    <w:p>
-      <w:pPr>
-        <w:pStyle w:val="NumberedParagraph"/>
+        <w:t xml:space="preserve">Notwithstanding its receipt of constructive notice of this case, on or about August 28, 2023, BNL served a garnishment on Shift4 Payments, Inc. (“Shift4”), the credit card processor used by Bourbon Street, in an effort to garnish the whole of Bourbon Street’s credit card sales for a post-petition period of time.</w:t>
+      </w:r>
+    </w:p>
+    <w:p>
+      <w:pPr>
+        <w:pStyle w:val="BodyText"/>
       </w:pPr>
       <w:r>
         <w:t xml:space="preserve">22.</w:t>
@@ -644,19 +1003,155 @@
         <w:t xml:space="preserve">Bourbon Street was compelled to have its general reorganization counsel contact the legal department for Shift4, send a formal correspondence urging Shift4 to not comply with the garnishment, and provide formal proof of this bankruptcy, in order for Bourbon Street to be disbursed several days of credit card sales that were being held pursuant to the garnishment of BNL.</w:t>
       </w:r>
     </w:p>
-    <w:bookmarkEnd w:id="23"/>
-    <w:bookmarkStart w:id="24" w:name="X5ccbfe51d938a95b86c0ededb67ccc49de8e203"/>
     <w:p>
       <w:pPr>
         <w:pStyle w:val="Heading2"/>
-      </w:pPr>
-      <w:r>
-        <w:t xml:space="preserve">Count I – Fraudulent Conveyance (11 U.S.C. § 548)</w:t>
-      </w:r>
-    </w:p>
-    <w:p>
-      <w:pPr>
-        <w:pStyle w:val="NumberedParagraph"/>
+        <w:keepNext/>
+        <w:keepLines/>
+        <w:spacing w:before="0" w:after="0" w:line="552" w:lineRule="exact"/>
+        <w:ind w:left="0" w:firstLine="0"/>
+        <w:jc w:val="center"/>
+      </w:pPr>
+      <w:r>
+        <w:rPr>
+          <w:b/>
+          <w:bCs/>
+          <w:caps w:val="0"/>
+        </w:rPr>
+        <w:t xml:space="preserve">Count</w:t>
+      </w:r>
+      <w:r>
+        <w:rPr>
+          <w:b/>
+          <w:bCs/>
+          <w:caps w:val="0"/>
+        </w:rPr>
+        <w:t xml:space="preserve"> </w:t>
+      </w:r>
+      <w:r>
+        <w:rPr>
+          <w:b/>
+          <w:bCs/>
+          <w:caps w:val="0"/>
+        </w:rPr>
+        <w:t xml:space="preserve">I</w:t>
+      </w:r>
+      <w:r>
+        <w:rPr>
+          <w:b/>
+          <w:bCs/>
+          <w:caps w:val="0"/>
+        </w:rPr>
+        <w:t xml:space="preserve"> </w:t>
+      </w:r>
+      <w:r>
+        <w:rPr>
+          <w:b/>
+          <w:bCs/>
+          <w:caps w:val="0"/>
+        </w:rPr>
+        <w:t xml:space="preserve">–</w:t>
+      </w:r>
+      <w:r>
+        <w:rPr>
+          <w:b/>
+          <w:bCs/>
+          <w:caps w:val="0"/>
+        </w:rPr>
+        <w:t xml:space="preserve"> </w:t>
+      </w:r>
+      <w:r>
+        <w:rPr>
+          <w:b/>
+          <w:bCs/>
+          <w:caps w:val="0"/>
+        </w:rPr>
+        <w:t xml:space="preserve">Fraudulent</w:t>
+      </w:r>
+      <w:r>
+        <w:rPr>
+          <w:b/>
+          <w:bCs/>
+          <w:caps w:val="0"/>
+        </w:rPr>
+        <w:t xml:space="preserve"> </w:t>
+      </w:r>
+      <w:r>
+        <w:rPr>
+          <w:b/>
+          <w:bCs/>
+          <w:caps w:val="0"/>
+        </w:rPr>
+        <w:t xml:space="preserve">Conveyance</w:t>
+      </w:r>
+      <w:r>
+        <w:rPr>
+          <w:b/>
+          <w:bCs/>
+          <w:caps w:val="0"/>
+        </w:rPr>
+        <w:t xml:space="preserve"> </w:t>
+      </w:r>
+      <w:r>
+        <w:rPr>
+          <w:b/>
+          <w:bCs/>
+          <w:caps w:val="0"/>
+        </w:rPr>
+        <w:t xml:space="preserve">(11</w:t>
+      </w:r>
+      <w:r>
+        <w:rPr>
+          <w:b/>
+          <w:bCs/>
+          <w:caps w:val="0"/>
+        </w:rPr>
+        <w:t xml:space="preserve"> </w:t>
+      </w:r>
+      <w:r>
+        <w:rPr>
+          <w:b/>
+          <w:bCs/>
+          <w:caps w:val="0"/>
+        </w:rPr>
+        <w:t xml:space="preserve">U.S.C.</w:t>
+      </w:r>
+      <w:r>
+        <w:rPr>
+          <w:b/>
+          <w:bCs/>
+          <w:caps w:val="0"/>
+        </w:rPr>
+        <w:t xml:space="preserve"> </w:t>
+      </w:r>
+      <w:r>
+        <w:rPr>
+          <w:b/>
+          <w:bCs/>
+          <w:caps w:val="0"/>
+        </w:rPr>
+        <w:t xml:space="preserve">§</w:t>
+      </w:r>
+      <w:r>
+        <w:rPr>
+          <w:b/>
+          <w:bCs/>
+          <w:caps w:val="0"/>
+        </w:rPr>
+        <w:t xml:space="preserve"> </w:t>
+      </w:r>
+      <w:r>
+        <w:rPr>
+          <w:b/>
+          <w:bCs/>
+          <w:caps w:val="0"/>
+        </w:rPr>
+        <w:t xml:space="preserve">548)</w:t>
+      </w:r>
+    </w:p>
+    <w:p>
+      <w:pPr>
+        <w:pStyle w:val="BodyText"/>
       </w:pPr>
       <w:r>
         <w:t xml:space="preserve">23.</w:t>
@@ -665,12 +1160,18 @@
         <w:tab/>
       </w:r>
       <w:r>
-        <w:t xml:space="preserve">Bourbon Street repeats and realleges paragraphs 1-22 of this Complaint, as though fully set forth herein.</w:t>
-      </w:r>
-    </w:p>
-    <w:p>
-      <w:pPr>
-        <w:pStyle w:val="NumberedParagraph"/>
+        <w:t xml:space="preserve">Bourbon Street repeats and realleges paragraphs 1</w:t>
+      </w:r>
+      <w:r>
+        <w:noBreakHyphen/>
+      </w:r>
+      <w:r>
+        <w:t xml:space="preserve">22 of this Complaint, as though fully set forth herein.</w:t>
+      </w:r>
+    </w:p>
+    <w:p>
+      <w:pPr>
+        <w:pStyle w:val="BodyText"/>
       </w:pPr>
       <w:r>
         <w:t xml:space="preserve">24.</w:t>
@@ -684,7 +1185,7 @@
     </w:p>
     <w:p>
       <w:pPr>
-        <w:pStyle w:val="NumberedParagraph"/>
+        <w:pStyle w:val="BodyText"/>
       </w:pPr>
       <w:r>
         <w:t xml:space="preserve">25.</w:t>
@@ -698,7 +1199,7 @@
     </w:p>
     <w:p>
       <w:pPr>
-        <w:pStyle w:val="NumberedParagraph"/>
+        <w:pStyle w:val="BodyText"/>
       </w:pPr>
       <w:r>
         <w:t xml:space="preserve">26.</w:t>
@@ -707,12 +1208,12 @@
         <w:tab/>
       </w:r>
       <w:r>
-        <w:t xml:space="preserve">Indeed, since the Debtor is a restaurant/bar, and its “receivables” are comprised of the funding of credit card payments tendered by diners/consumers, BNL did not undertake any cognizable risk of the Debtor not collecting the promised sum of $1,284.38 in revenues each week for a series of approximately 32 weeks.</w:t>
-      </w:r>
-    </w:p>
-    <w:p>
-      <w:pPr>
-        <w:pStyle w:val="NumberedParagraph"/>
+        <w:t xml:space="preserve">Indeed, since the Debtor is a restaurant/​bar, and its “receivables” are comprised of the funding of credit card payments tendered by diners/​consumers, BNL did not undertake any cognizable risk of the Debtor not collecting the promised sum of $1,284.38 in revenues each week for a series of approximately 32 weeks.</w:t>
+      </w:r>
+    </w:p>
+    <w:p>
+      <w:pPr>
+        <w:pStyle w:val="BodyText"/>
       </w:pPr>
       <w:r>
         <w:t xml:space="preserve">27.</w:t>
@@ -726,7 +1227,7 @@
     </w:p>
     <w:p>
       <w:pPr>
-        <w:pStyle w:val="NumberedParagraph"/>
+        <w:pStyle w:val="BodyText"/>
       </w:pPr>
       <w:r>
         <w:t xml:space="preserve">28.</w:t>
@@ -740,7 +1241,7 @@
     </w:p>
     <w:p>
       <w:pPr>
-        <w:pStyle w:val="NumberedParagraph"/>
+        <w:pStyle w:val="BodyText"/>
       </w:pPr>
       <w:r>
         <w:t xml:space="preserve">29.</w:t>
@@ -754,7 +1255,7 @@
     </w:p>
     <w:p>
       <w:pPr>
-        <w:pStyle w:val="NumberedParagraph"/>
+        <w:pStyle w:val="BodyText"/>
       </w:pPr>
       <w:r>
         <w:t xml:space="preserve">30.</w:t>
@@ -768,25 +1269,249 @@
     </w:p>
     <w:p>
       <w:pPr>
-        <w:pStyle w:val="NumberedParagraph"/>
-      </w:pPr>
-      <w:r>
-        <w:t xml:space="preserve">WHEREFORE, Bourbon Street respectfully prays this Honorable Court (i) avoid the Debtor’s obligations under the Agreement; (ii) avoid the UCC-1 filing of BNL together with any other security interest, perfected or inchoate, of BNL; and (iii) afford such other and further relief as may be just and proper.</w:t>
-      </w:r>
-    </w:p>
-    <w:bookmarkEnd w:id="24"/>
-    <w:bookmarkStart w:id="25" w:name="X5f9b38683a7404d5d92737ab43a656e26e745ca"/>
+        <w:pStyle w:val="BodyText"/>
+      </w:pPr>
+      <w:r>
+        <w:t xml:space="preserve">WHEREFORE, Bourbon Street respectfully prays this Honorable Court (i) avoid the Debtor’s obligations under the Agreement; (ii) avoid the UCC</w:t>
+      </w:r>
+      <w:r>
+        <w:noBreakHyphen/>
+      </w:r>
+      <w:r>
+        <w:t xml:space="preserve">1 filing of BNL together with any other security interest, perfected or inchoate, of BNL; and (iii) afford such other and further relief as may be just and proper.</w:t>
+      </w:r>
+    </w:p>
     <w:p>
       <w:pPr>
         <w:pStyle w:val="Heading2"/>
-      </w:pPr>
-      <w:r>
-        <w:t xml:space="preserve">Count II – Uniform Voidable Transactions Act (N.D. Cent. Code § 13-02.1, et seq.)</w:t>
-      </w:r>
-    </w:p>
-    <w:p>
-      <w:pPr>
-        <w:pStyle w:val="NumberedParagraph"/>
+        <w:keepNext/>
+        <w:keepLines/>
+        <w:spacing w:before="0" w:after="0" w:line="552" w:lineRule="exact"/>
+        <w:ind w:left="0" w:firstLine="0"/>
+        <w:jc w:val="center"/>
+      </w:pPr>
+      <w:r>
+        <w:rPr>
+          <w:b/>
+          <w:bCs/>
+          <w:caps w:val="0"/>
+        </w:rPr>
+        <w:t xml:space="preserve">Count</w:t>
+      </w:r>
+      <w:r>
+        <w:rPr>
+          <w:b/>
+          <w:bCs/>
+          <w:caps w:val="0"/>
+        </w:rPr>
+        <w:t xml:space="preserve"> </w:t>
+      </w:r>
+      <w:r>
+        <w:rPr>
+          <w:b/>
+          <w:bCs/>
+          <w:caps w:val="0"/>
+        </w:rPr>
+        <w:t xml:space="preserve">II</w:t>
+      </w:r>
+      <w:r>
+        <w:rPr>
+          <w:b/>
+          <w:bCs/>
+          <w:caps w:val="0"/>
+        </w:rPr>
+        <w:t xml:space="preserve"> </w:t>
+      </w:r>
+      <w:r>
+        <w:rPr>
+          <w:b/>
+          <w:bCs/>
+          <w:caps w:val="0"/>
+        </w:rPr>
+        <w:t xml:space="preserve">–</w:t>
+      </w:r>
+      <w:r>
+        <w:rPr>
+          <w:b/>
+          <w:bCs/>
+          <w:caps w:val="0"/>
+        </w:rPr>
+        <w:t xml:space="preserve"> </w:t>
+      </w:r>
+      <w:r>
+        <w:rPr>
+          <w:b/>
+          <w:bCs/>
+          <w:caps w:val="0"/>
+        </w:rPr>
+        <w:t xml:space="preserve">Uniform</w:t>
+      </w:r>
+      <w:r>
+        <w:rPr>
+          <w:b/>
+          <w:bCs/>
+          <w:caps w:val="0"/>
+        </w:rPr>
+        <w:t xml:space="preserve"> </w:t>
+      </w:r>
+      <w:r>
+        <w:rPr>
+          <w:b/>
+          <w:bCs/>
+          <w:caps w:val="0"/>
+        </w:rPr>
+        <w:t xml:space="preserve">Voidable</w:t>
+      </w:r>
+      <w:r>
+        <w:rPr>
+          <w:b/>
+          <w:bCs/>
+          <w:caps w:val="0"/>
+        </w:rPr>
+        <w:t xml:space="preserve"> </w:t>
+      </w:r>
+      <w:r>
+        <w:rPr>
+          <w:b/>
+          <w:bCs/>
+          <w:caps w:val="0"/>
+        </w:rPr>
+        <w:t xml:space="preserve">Transactions</w:t>
+      </w:r>
+      <w:r>
+        <w:rPr>
+          <w:b/>
+          <w:bCs/>
+          <w:caps w:val="0"/>
+        </w:rPr>
+        <w:t xml:space="preserve"> </w:t>
+      </w:r>
+      <w:r>
+        <w:rPr>
+          <w:b/>
+          <w:bCs/>
+          <w:caps w:val="0"/>
+        </w:rPr>
+        <w:t xml:space="preserve">Act</w:t>
+      </w:r>
+      <w:r>
+        <w:rPr>
+          <w:b/>
+          <w:bCs/>
+          <w:caps w:val="0"/>
+        </w:rPr>
+        <w:t xml:space="preserve"> </w:t>
+      </w:r>
+      <w:r>
+        <w:rPr>
+          <w:b/>
+          <w:bCs/>
+          <w:caps w:val="0"/>
+        </w:rPr>
+        <w:t xml:space="preserve">(N.D.</w:t>
+      </w:r>
+      <w:r>
+        <w:rPr>
+          <w:b/>
+          <w:bCs/>
+          <w:caps w:val="0"/>
+        </w:rPr>
+        <w:t xml:space="preserve"> </w:t>
+      </w:r>
+      <w:r>
+        <w:rPr>
+          <w:b/>
+          <w:bCs/>
+          <w:caps w:val="0"/>
+        </w:rPr>
+        <w:t xml:space="preserve">Cent.</w:t>
+      </w:r>
+      <w:r>
+        <w:rPr>
+          <w:b/>
+          <w:bCs/>
+          <w:caps w:val="0"/>
+        </w:rPr>
+        <w:t xml:space="preserve"> </w:t>
+      </w:r>
+      <w:r>
+        <w:rPr>
+          <w:b/>
+          <w:bCs/>
+          <w:caps w:val="0"/>
+        </w:rPr>
+        <w:t xml:space="preserve">Code</w:t>
+      </w:r>
+      <w:r>
+        <w:rPr>
+          <w:b/>
+          <w:bCs/>
+          <w:caps w:val="0"/>
+        </w:rPr>
+        <w:t xml:space="preserve"> </w:t>
+      </w:r>
+      <w:r>
+        <w:rPr>
+          <w:b/>
+          <w:bCs/>
+          <w:caps w:val="0"/>
+        </w:rPr>
+        <w:t xml:space="preserve">§</w:t>
+      </w:r>
+      <w:r>
+        <w:rPr>
+          <w:b/>
+          <w:bCs/>
+          <w:caps w:val="0"/>
+        </w:rPr>
+        <w:t xml:space="preserve"> </w:t>
+      </w:r>
+      <w:r>
+        <w:rPr>
+          <w:b/>
+          <w:bCs/>
+          <w:caps w:val="0"/>
+        </w:rPr>
+        <w:t xml:space="preserve">13</w:t>
+        <w:noBreakHyphen/>
+        <w:t xml:space="preserve">02.1,</w:t>
+      </w:r>
+      <w:r>
+        <w:rPr>
+          <w:b/>
+          <w:bCs/>
+          <w:caps w:val="0"/>
+        </w:rPr>
+        <w:t xml:space="preserve"> </w:t>
+      </w:r>
+      <w:r>
+        <w:rPr>
+          <w:b/>
+          <w:bCs/>
+          <w:caps w:val="0"/>
+        </w:rPr>
+        <w:t xml:space="preserve">et</w:t>
+      </w:r>
+      <w:r>
+        <w:rPr>
+          <w:b/>
+          <w:bCs/>
+          <w:caps w:val="0"/>
+        </w:rPr>
+        <w:t xml:space="preserve"> </w:t>
+      </w:r>
+      <w:r>
+        <w:rPr>
+          <w:b/>
+          <w:bCs/>
+          <w:caps w:val="0"/>
+        </w:rPr>
+        <w:t xml:space="preserve">seq.)</w:t>
+      </w:r>
+    </w:p>
+    <w:p>
+      <w:pPr>
+        <w:pStyle w:val="BodyText"/>
       </w:pPr>
       <w:r>
         <w:t xml:space="preserve">31.</w:t>
@@ -795,12 +1520,18 @@
         <w:tab/>
       </w:r>
       <w:r>
-        <w:t xml:space="preserve">Bourbon Street repeats and realleges paragraphs 1-22 of this Complaint, as though fully set forth herein.</w:t>
-      </w:r>
-    </w:p>
-    <w:p>
-      <w:pPr>
-        <w:pStyle w:val="NumberedParagraph"/>
+        <w:t xml:space="preserve">Bourbon Street repeats and realleges paragraphs 1</w:t>
+      </w:r>
+      <w:r>
+        <w:noBreakHyphen/>
+      </w:r>
+      <w:r>
+        <w:t xml:space="preserve">22 of this Complaint, as though fully set forth herein.</w:t>
+      </w:r>
+    </w:p>
+    <w:p>
+      <w:pPr>
+        <w:pStyle w:val="BodyText"/>
       </w:pPr>
       <w:r>
         <w:t xml:space="preserve">32.</w:t>
@@ -809,12 +1540,24 @@
         <w:tab/>
       </w:r>
       <w:r>
-        <w:t xml:space="preserve">Bourbon Street was insolvent, within the definition afforded by Section 13-02.1-02 of the North Dakota Century Code, at the time Bourbon Street entered into the Agreement with BNL.</w:t>
-      </w:r>
-    </w:p>
-    <w:p>
-      <w:pPr>
-        <w:pStyle w:val="NumberedParagraph"/>
+        <w:t xml:space="preserve">Bourbon Street was insolvent, within the definition afforded by Section 13</w:t>
+      </w:r>
+      <w:r>
+        <w:noBreakHyphen/>
+      </w:r>
+      <w:r>
+        <w:t xml:space="preserve">02.1</w:t>
+      </w:r>
+      <w:r>
+        <w:noBreakHyphen/>
+      </w:r>
+      <w:r>
+        <w:t xml:space="preserve">02 of the North Dakota Century Code, at the time Bourbon Street entered into the Agreement with BNL.</w:t>
+      </w:r>
+    </w:p>
+    <w:p>
+      <w:pPr>
+        <w:pStyle w:val="BodyText"/>
       </w:pPr>
       <w:r>
         <w:t xml:space="preserve">33.</w:t>
@@ -823,12 +1566,18 @@
         <w:tab/>
       </w:r>
       <w:r>
-        <w:t xml:space="preserve">Bourbon Street repeats and realleged paragraphs 24-28 of this Complaint, as though fully set forth herein, and submits the same allege the Agreement to have not afforded reasonably equivalent value to Bourbon Street.</w:t>
-      </w:r>
-    </w:p>
-    <w:p>
-      <w:pPr>
-        <w:pStyle w:val="NumberedParagraph"/>
+        <w:t xml:space="preserve">Bourbon Street repeats and realleged paragraphs 24</w:t>
+      </w:r>
+      <w:r>
+        <w:noBreakHyphen/>
+      </w:r>
+      <w:r>
+        <w:t xml:space="preserve">28 of this Complaint, as though fully set forth herein, and submits the same allege the Agreement to have not afforded reasonably equivalent value to Bourbon Street.</w:t>
+      </w:r>
+    </w:p>
+    <w:p>
+      <w:pPr>
+        <w:pStyle w:val="BodyText"/>
       </w:pPr>
       <w:r>
         <w:t xml:space="preserve">34.</w:t>
@@ -837,30 +1586,268 @@
         <w:tab/>
       </w:r>
       <w:r>
-        <w:t xml:space="preserve">Pursuant to Section 13-02.1-11 of the North Dakota Century Code, the claims set forth in this Count II are governed by North Dakota law, notwithstanding a New York choice of law provision in the Agreement.</w:t>
-      </w:r>
-    </w:p>
-    <w:p>
-      <w:pPr>
-        <w:pStyle w:val="NumberedParagraph"/>
-      </w:pPr>
-      <w:r>
-        <w:t xml:space="preserve">WHEREFORE, Bourbon Street respectfully prays this Honorable Court (i) avoid the Debtor’s obligations under the Agreement, pursuant to Section 544 of Title 11 of the United States Code and Section 13-02.1-04 of the North Dakota Century Code; (ii) avoid the Debtor’s obligations under the Agreement, pursuant to Section 544 of Title 11 of the United States Code and Section 13-02.1-05 of the North Dakota Century Code; (iii) avoid the UCC-1 filing of BNL together with any other security interest, perfected or inchoate, of BNL, pursuant to Section 544 of Title 11 of the United States Code and Section 13-01.1-07 of the North Dakota Century Code; and (iv) afford such other and further relief as may be just and proper.</w:t>
-      </w:r>
-    </w:p>
-    <w:bookmarkEnd w:id="25"/>
-    <w:bookmarkStart w:id="26" w:name="Xec7cb6352529527a323182b1768c9e775187acd"/>
+        <w:t xml:space="preserve">Pursuant to Section 13</w:t>
+      </w:r>
+      <w:r>
+        <w:noBreakHyphen/>
+      </w:r>
+      <w:r>
+        <w:t xml:space="preserve">02.1</w:t>
+      </w:r>
+      <w:r>
+        <w:noBreakHyphen/>
+      </w:r>
+      <w:r>
+        <w:t xml:space="preserve">11 of the North Dakota Century Code, the claims set forth in this Count II are governed by North Dakota law, notwithstanding a New York choice of law provision in the Agreement.</w:t>
+      </w:r>
+    </w:p>
+    <w:p>
+      <w:pPr>
+        <w:pStyle w:val="BodyText"/>
+      </w:pPr>
+      <w:r>
+        <w:t xml:space="preserve">WHEREFORE, Bourbon Street respectfully prays this Honorable Court (i) avoid the Debtor’s obligations under the Agreement, pursuant to Section 544 of Title 11 of the United States Code and Section 13</w:t>
+      </w:r>
+      <w:r>
+        <w:noBreakHyphen/>
+      </w:r>
+      <w:r>
+        <w:t xml:space="preserve">02.1</w:t>
+      </w:r>
+      <w:r>
+        <w:noBreakHyphen/>
+      </w:r>
+      <w:r>
+        <w:t xml:space="preserve">04 of the North Dakota Century Code; (ii) avoid the Debtor’s obligations under the Agreement, pursuant to Section 544 of Title 11 of the United States Code and Section 13</w:t>
+      </w:r>
+      <w:r>
+        <w:noBreakHyphen/>
+      </w:r>
+      <w:r>
+        <w:t xml:space="preserve">02.1</w:t>
+      </w:r>
+      <w:r>
+        <w:noBreakHyphen/>
+      </w:r>
+      <w:r>
+        <w:t xml:space="preserve">05 of the North Dakota Century Code; (iii) avoid the UCC</w:t>
+      </w:r>
+      <w:r>
+        <w:noBreakHyphen/>
+      </w:r>
+      <w:r>
+        <w:t xml:space="preserve">1 filing of BNL together with any other security interest, perfected or inchoate, of BNL, pursuant to Section 544 of Title 11 of the United States Code and Section 13</w:t>
+      </w:r>
+      <w:r>
+        <w:noBreakHyphen/>
+      </w:r>
+      <w:r>
+        <w:t xml:space="preserve">01.1</w:t>
+      </w:r>
+      <w:r>
+        <w:noBreakHyphen/>
+      </w:r>
+      <w:r>
+        <w:t xml:space="preserve">07 of the North Dakota Century Code; and (iv) afford such other and further relief as may be just and proper.</w:t>
+      </w:r>
+    </w:p>
     <w:p>
       <w:pPr>
         <w:pStyle w:val="Heading2"/>
-      </w:pPr>
-      <w:r>
-        <w:t xml:space="preserve">Count III – Violation of the Automatic Stay (11 U.S.C. § 362)</w:t>
-      </w:r>
-    </w:p>
-    <w:p>
-      <w:pPr>
-        <w:pStyle w:val="NumberedParagraph"/>
+        <w:keepNext/>
+        <w:keepLines/>
+        <w:spacing w:before="0" w:after="0" w:line="552" w:lineRule="exact"/>
+        <w:ind w:left="0" w:firstLine="0"/>
+        <w:jc w:val="center"/>
+      </w:pPr>
+      <w:r>
+        <w:rPr>
+          <w:b/>
+          <w:bCs/>
+          <w:caps w:val="0"/>
+        </w:rPr>
+        <w:t xml:space="preserve">Count</w:t>
+      </w:r>
+      <w:r>
+        <w:rPr>
+          <w:b/>
+          <w:bCs/>
+          <w:caps w:val="0"/>
+        </w:rPr>
+        <w:t xml:space="preserve"> </w:t>
+      </w:r>
+      <w:r>
+        <w:rPr>
+          <w:b/>
+          <w:bCs/>
+          <w:caps w:val="0"/>
+        </w:rPr>
+        <w:t xml:space="preserve">III</w:t>
+      </w:r>
+      <w:r>
+        <w:rPr>
+          <w:b/>
+          <w:bCs/>
+          <w:caps w:val="0"/>
+        </w:rPr>
+        <w:t xml:space="preserve"> </w:t>
+      </w:r>
+      <w:r>
+        <w:rPr>
+          <w:b/>
+          <w:bCs/>
+          <w:caps w:val="0"/>
+        </w:rPr>
+        <w:t xml:space="preserve">–</w:t>
+      </w:r>
+      <w:r>
+        <w:rPr>
+          <w:b/>
+          <w:bCs/>
+          <w:caps w:val="0"/>
+        </w:rPr>
+        <w:t xml:space="preserve"> </w:t>
+      </w:r>
+      <w:r>
+        <w:rPr>
+          <w:b/>
+          <w:bCs/>
+          <w:caps w:val="0"/>
+        </w:rPr>
+        <w:t xml:space="preserve">Violation</w:t>
+      </w:r>
+      <w:r>
+        <w:rPr>
+          <w:b/>
+          <w:bCs/>
+          <w:caps w:val="0"/>
+        </w:rPr>
+        <w:t xml:space="preserve"> </w:t>
+      </w:r>
+      <w:r>
+        <w:rPr>
+          <w:b/>
+          <w:bCs/>
+          <w:caps w:val="0"/>
+        </w:rPr>
+        <w:t xml:space="preserve">of</w:t>
+      </w:r>
+      <w:r>
+        <w:rPr>
+          <w:b/>
+          <w:bCs/>
+          <w:caps w:val="0"/>
+        </w:rPr>
+        <w:t xml:space="preserve"> </w:t>
+      </w:r>
+      <w:r>
+        <w:rPr>
+          <w:b/>
+          <w:bCs/>
+          <w:caps w:val="0"/>
+        </w:rPr>
+        <w:t xml:space="preserve">the</w:t>
+      </w:r>
+      <w:r>
+        <w:rPr>
+          <w:b/>
+          <w:bCs/>
+          <w:caps w:val="0"/>
+        </w:rPr>
+        <w:t xml:space="preserve"> </w:t>
+      </w:r>
+      <w:r>
+        <w:rPr>
+          <w:b/>
+          <w:bCs/>
+          <w:caps w:val="0"/>
+        </w:rPr>
+        <w:t xml:space="preserve">Automatic</w:t>
+      </w:r>
+      <w:r>
+        <w:rPr>
+          <w:b/>
+          <w:bCs/>
+          <w:caps w:val="0"/>
+        </w:rPr>
+        <w:t xml:space="preserve"> </w:t>
+      </w:r>
+      <w:r>
+        <w:rPr>
+          <w:b/>
+          <w:bCs/>
+          <w:caps w:val="0"/>
+        </w:rPr>
+        <w:t xml:space="preserve">Stay</w:t>
+      </w:r>
+      <w:r>
+        <w:rPr>
+          <w:b/>
+          <w:bCs/>
+          <w:caps w:val="0"/>
+        </w:rPr>
+        <w:t xml:space="preserve"> </w:t>
+      </w:r>
+      <w:r>
+        <w:rPr>
+          <w:b/>
+          <w:bCs/>
+          <w:caps w:val="0"/>
+        </w:rPr>
+        <w:t xml:space="preserve">(11</w:t>
+      </w:r>
+      <w:r>
+        <w:rPr>
+          <w:b/>
+          <w:bCs/>
+          <w:caps w:val="0"/>
+        </w:rPr>
+        <w:t xml:space="preserve"> </w:t>
+      </w:r>
+      <w:r>
+        <w:rPr>
+          <w:b/>
+          <w:bCs/>
+          <w:caps w:val="0"/>
+        </w:rPr>
+        <w:t xml:space="preserve">U.S.C.</w:t>
+      </w:r>
+      <w:r>
+        <w:rPr>
+          <w:b/>
+          <w:bCs/>
+          <w:caps w:val="0"/>
+        </w:rPr>
+        <w:t xml:space="preserve"> </w:t>
+      </w:r>
+      <w:r>
+        <w:rPr>
+          <w:b/>
+          <w:bCs/>
+          <w:caps w:val="0"/>
+        </w:rPr>
+        <w:t xml:space="preserve">§</w:t>
+      </w:r>
+      <w:r>
+        <w:rPr>
+          <w:b/>
+          <w:bCs/>
+          <w:caps w:val="0"/>
+        </w:rPr>
+        <w:t xml:space="preserve"> </w:t>
+      </w:r>
+      <w:r>
+        <w:rPr>
+          <w:b/>
+          <w:bCs/>
+          <w:caps w:val="0"/>
+        </w:rPr>
+        <w:t xml:space="preserve">362)</w:t>
+      </w:r>
+    </w:p>
+    <w:p>
+      <w:pPr>
+        <w:pStyle w:val="BodyText"/>
       </w:pPr>
       <w:r>
         <w:t xml:space="preserve">35.</w:t>
@@ -869,12 +1856,18 @@
         <w:tab/>
       </w:r>
       <w:r>
-        <w:t xml:space="preserve">Bourbon Street repeats and realleges paragraphs 1-22 of this Complaint, as though fully set forth herein.</w:t>
-      </w:r>
-    </w:p>
-    <w:p>
-      <w:pPr>
-        <w:pStyle w:val="NumberedParagraph"/>
+        <w:t xml:space="preserve">Bourbon Street repeats and realleges paragraphs 1</w:t>
+      </w:r>
+      <w:r>
+        <w:noBreakHyphen/>
+      </w:r>
+      <w:r>
+        <w:t xml:space="preserve">22 of this Complaint, as though fully set forth herein.</w:t>
+      </w:r>
+    </w:p>
+    <w:p>
+      <w:pPr>
+        <w:pStyle w:val="BodyText"/>
       </w:pPr>
       <w:r>
         <w:t xml:space="preserve">36.</w:t>
@@ -888,7 +1881,7 @@
     </w:p>
     <w:p>
       <w:pPr>
-        <w:pStyle w:val="NumberedParagraph"/>
+        <w:pStyle w:val="BodyText"/>
       </w:pPr>
       <w:r>
         <w:t xml:space="preserve">37.</w:t>
@@ -902,7 +1895,7 @@
     </w:p>
     <w:p>
       <w:pPr>
-        <w:pStyle w:val="NumberedParagraph"/>
+        <w:pStyle w:val="BodyText"/>
       </w:pPr>
       <w:r>
         <w:t xml:space="preserve">38.</w:t>
@@ -916,7 +1909,7 @@
     </w:p>
     <w:p>
       <w:pPr>
-        <w:pStyle w:val="NumberedParagraph"/>
+        <w:pStyle w:val="BodyText"/>
       </w:pPr>
       <w:r>
         <w:t xml:space="preserve">39.</w:t>
@@ -930,7 +1923,7 @@
     </w:p>
     <w:p>
       <w:pPr>
-        <w:pStyle w:val="NumberedParagraph"/>
+        <w:pStyle w:val="BodyText"/>
       </w:pPr>
       <w:r>
         <w:t xml:space="preserve">WHEREFORE, Bourbon Street respectfully prays this Honorable Court (i) enter judgment against BNL, and in favor of Bourbon Street, in a sum equal to the damages sustained by Bourbon Street on account of BNL’s violation of Section 362 of Title 11 of the United States Code; and (ii) afford such other and further relief as may be just and proper.</w:t>
@@ -938,33 +1931,23 @@
     </w:p>
     <w:p>
       <w:pPr>
-        <w:pStyle w:val="NumberedParagraphKeepNext"/>
+        <w:pStyle w:val="BodyTextKeep"/>
       </w:pPr>
       <w:r>
         <w:t xml:space="preserve">Plaintiff does not consent to the entry of final orders or judgment by the Bankruptcy Court.</w:t>
       </w:r>
-    </w:p>
-    <w:p>
-      <w:pPr>
-        <w:pStyle w:val="BodyText"/>
-      </w:pPr>
     </w:p>
     <w:tbl>
       <w:tblPr>
         <w:tblW w:w="9360" w:type="dxa"/>
         <w:tblLayout w:type="fixed"/>
-        <w:tblBorders>
-          <w:top w:val="nil"/>
-          <w:left w:val="nil"/>
-          <w:bottom w:val="nil"/>
-          <w:right w:val="nil"/>
-          <w:insideH w:val="nil"/>
-          <w:insideV w:val="nil"/>
-        </w:tblBorders>
         <w:tblCellMar>
+          <w:top w:w="0" w:type="dxa"/>
           <w:left w:w="0" w:type="dxa"/>
+          <w:bottom w:w="0" w:type="dxa"/>
           <w:right w:w="0" w:type="dxa"/>
         </w:tblCellMar>
+        <w:tblLook w:val="0000" w:firstRow="0" w:lastRow="0" w:firstColumn="0" w:lastColumn="0" w:noHBand="0" w:noVBand="0"/>
       </w:tblPr>
       <w:tblGrid>
         <w:gridCol w:w="4320"/>
@@ -977,25 +1960,42 @@
         <w:tc>
           <w:tcPr>
             <w:tcW w:w="4320" w:type="dxa"/>
-            <w:vAlign w:val="top"/>
           </w:tcPr>
           <w:p>
             <w:pPr>
-              <w:pStyle w:val="SingleSpaced"/>
-            </w:pPr>
-            <w:r>
-              <w:t xml:space="preserve">Dated: September 2, 2023</w:t>
+              <w:spacing w:before="276" w:after="0" w:line="276" w:lineRule="exact"/>
+              <w:ind w:left="0" w:firstLine="0"/>
+              <w:jc w:val="left"/>
+            </w:pPr>
+            <w:r>
+              <w:t xml:space="preserve">Dated: </w:t>
+            </w:r>
+            <w:r>
+              <w:t xml:space="preserve">September</w:t>
+            </w:r>
+            <w:r>
+              <w:t xml:space="preserve"> </w:t>
+            </w:r>
+            <w:r>
+              <w:t xml:space="preserve">2,</w:t>
+            </w:r>
+            <w:r>
+              <w:t xml:space="preserve"> </w:t>
+            </w:r>
+            <w:r>
+              <w:t xml:space="preserve">2023</w:t>
             </w:r>
           </w:p>
         </w:tc>
         <w:tc>
           <w:tcPr>
             <w:tcW w:w="5040" w:type="dxa"/>
-            <w:vAlign w:val="top"/>
           </w:tcPr>
           <w:p>
             <w:pPr>
-              <w:pStyle w:val="SingleSpaced"/>
+              <w:spacing w:before="276" w:after="0" w:line="276" w:lineRule="exact"/>
+              <w:ind w:left="0" w:firstLine="0"/>
+              <w:jc w:val="left"/>
             </w:pPr>
             <w:r>
               <w:t xml:space="preserve">Respectfully submitted,</w:t>
@@ -1003,12 +2003,9 @@
           </w:p>
           <w:p>
             <w:pPr>
-              <w:pStyle w:val="SingleSpaced"/>
-            </w:pPr>
-          </w:p>
-          <w:p>
-            <w:pPr>
-              <w:pStyle w:val="SingleSpaced"/>
+              <w:spacing w:before="276" w:after="0" w:line="276" w:lineRule="exact"/>
+              <w:ind w:left="0" w:firstLine="0"/>
+              <w:jc w:val="left"/>
             </w:pPr>
             <w:r>
               <w:t xml:space="preserve">By: /s/ Maurice B. VerStandig</w:t>
@@ -1016,60 +2013,175 @@
           </w:p>
           <w:p>
             <w:pPr>
-              <w:pStyle w:val="SingleSpaced"/>
-            </w:pPr>
-          </w:p>
-          <w:p>
-            <w:pPr>
-              <w:pStyle w:val="SingleSpaced"/>
-            </w:pPr>
-            <w:r>
-              <w:t xml:space="preserve">Maurice B. VerStandig, Esq.</w:t>
-            </w:r>
-          </w:p>
-          <w:p>
-            <w:pPr>
-              <w:pStyle w:val="SingleSpaced"/>
-            </w:pPr>
-            <w:r>
-              <w:t xml:space="preserve">The Dakota Bankruptcy Firm</w:t>
-            </w:r>
-          </w:p>
-          <w:p>
-            <w:pPr>
-              <w:pStyle w:val="SingleSpaced"/>
-            </w:pPr>
-            <w:r>
-              <w:t xml:space="preserve">1630 1st Avenue N</w:t>
-            </w:r>
-          </w:p>
-          <w:p>
-            <w:pPr>
-              <w:pStyle w:val="SingleSpaced"/>
-            </w:pPr>
-            <w:r>
-              <w:t xml:space="preserve">Suite B PMB 24</w:t>
-            </w:r>
-          </w:p>
-          <w:p>
-            <w:pPr>
-              <w:pStyle w:val="SingleSpaced"/>
-            </w:pPr>
-            <w:r>
-              <w:t xml:space="preserve">Fargo, North Dakota 58102-4246</w:t>
-            </w:r>
-          </w:p>
-          <w:p>
-            <w:pPr>
-              <w:pStyle w:val="SingleSpaced"/>
-            </w:pPr>
-            <w:r>
-              <w:t xml:space="preserve">Phone: (701) 394-3215</w:t>
-            </w:r>
-          </w:p>
-          <w:p>
-            <w:pPr>
-              <w:pStyle w:val="SingleSpaced"/>
+              <w:spacing w:before="276" w:after="0" w:line="276" w:lineRule="exact"/>
+              <w:ind w:left="0" w:firstLine="0"/>
+              <w:jc w:val="left"/>
+            </w:pPr>
+            <w:r>
+              <w:t xml:space="preserve">Maurice</w:t>
+            </w:r>
+            <w:r>
+              <w:t xml:space="preserve"> </w:t>
+            </w:r>
+            <w:r>
+              <w:t xml:space="preserve">B.</w:t>
+            </w:r>
+            <w:r>
+              <w:t xml:space="preserve"> </w:t>
+            </w:r>
+            <w:r>
+              <w:t xml:space="preserve">VerStandig,</w:t>
+            </w:r>
+            <w:r>
+              <w:t xml:space="preserve"> </w:t>
+            </w:r>
+            <w:r>
+              <w:t xml:space="preserve">Esq.</w:t>
+            </w:r>
+          </w:p>
+          <w:p>
+            <w:pPr>
+              <w:spacing w:before="0" w:after="0" w:line="276" w:lineRule="exact"/>
+              <w:ind w:left="0" w:firstLine="0"/>
+              <w:jc w:val="left"/>
+            </w:pPr>
+            <w:r>
+              <w:t xml:space="preserve">The</w:t>
+            </w:r>
+            <w:r>
+              <w:t xml:space="preserve"> </w:t>
+            </w:r>
+            <w:r>
+              <w:t xml:space="preserve">Dakota</w:t>
+            </w:r>
+            <w:r>
+              <w:t xml:space="preserve"> </w:t>
+            </w:r>
+            <w:r>
+              <w:t xml:space="preserve">Bankruptcy</w:t>
+            </w:r>
+            <w:r>
+              <w:t xml:space="preserve"> </w:t>
+            </w:r>
+            <w:r>
+              <w:t xml:space="preserve">Firm</w:t>
+            </w:r>
+          </w:p>
+          <w:p>
+            <w:pPr>
+              <w:spacing w:before="0" w:after="0" w:line="276" w:lineRule="exact"/>
+              <w:ind w:left="0" w:firstLine="0"/>
+              <w:jc w:val="left"/>
+            </w:pPr>
+            <w:r>
+              <w:t xml:space="preserve">1630</w:t>
+            </w:r>
+            <w:r>
+              <w:t xml:space="preserve"> </w:t>
+            </w:r>
+            <w:r>
+              <w:t xml:space="preserve">1st</w:t>
+            </w:r>
+            <w:r>
+              <w:t xml:space="preserve"> </w:t>
+            </w:r>
+            <w:r>
+              <w:t xml:space="preserve">Avenue</w:t>
+            </w:r>
+            <w:r>
+              <w:t xml:space="preserve"> </w:t>
+            </w:r>
+            <w:r>
+              <w:t xml:space="preserve">N</w:t>
+            </w:r>
+          </w:p>
+          <w:p>
+            <w:pPr>
+              <w:spacing w:before="0" w:after="0" w:line="276" w:lineRule="exact"/>
+              <w:ind w:left="0" w:firstLine="0"/>
+              <w:jc w:val="left"/>
+            </w:pPr>
+            <w:r>
+              <w:t xml:space="preserve">Suite</w:t>
+            </w:r>
+            <w:r>
+              <w:t xml:space="preserve"> </w:t>
+            </w:r>
+            <w:r>
+              <w:t xml:space="preserve">B</w:t>
+            </w:r>
+            <w:r>
+              <w:t xml:space="preserve"> </w:t>
+            </w:r>
+            <w:r>
+              <w:t xml:space="preserve">PMB</w:t>
+            </w:r>
+            <w:r>
+              <w:t xml:space="preserve"> </w:t>
+            </w:r>
+            <w:r>
+              <w:t xml:space="preserve">24</w:t>
+            </w:r>
+          </w:p>
+          <w:p>
+            <w:pPr>
+              <w:spacing w:before="0" w:after="0" w:line="276" w:lineRule="exact"/>
+              <w:ind w:left="0" w:firstLine="0"/>
+              <w:jc w:val="left"/>
+            </w:pPr>
+            <w:r>
+              <w:t xml:space="preserve">Fargo,</w:t>
+            </w:r>
+            <w:r>
+              <w:t xml:space="preserve"> </w:t>
+            </w:r>
+            <w:r>
+              <w:t xml:space="preserve">North</w:t>
+            </w:r>
+            <w:r>
+              <w:t xml:space="preserve"> </w:t>
+            </w:r>
+            <w:r>
+              <w:t xml:space="preserve">Dakota</w:t>
+            </w:r>
+            <w:r>
+              <w:t xml:space="preserve"> </w:t>
+            </w:r>
+            <w:r>
+              <w:t xml:space="preserve">58102</w:t>
+              <w:noBreakHyphen/>
+              <w:t xml:space="preserve">4246</w:t>
+            </w:r>
+          </w:p>
+          <w:p>
+            <w:pPr>
+              <w:spacing w:before="0" w:after="0" w:line="276" w:lineRule="exact"/>
+              <w:ind w:left="0" w:firstLine="0"/>
+              <w:jc w:val="left"/>
+            </w:pPr>
+            <w:r>
+              <w:t xml:space="preserve">Phone:</w:t>
+            </w:r>
+            <w:r>
+              <w:t xml:space="preserve"> </w:t>
+            </w:r>
+            <w:r>
+              <w:t xml:space="preserve">(701)</w:t>
+            </w:r>
+            <w:r>
+              <w:t xml:space="preserve"> </w:t>
+            </w:r>
+            <w:r>
+              <w:t xml:space="preserve">394</w:t>
+              <w:noBreakHyphen/>
+              <w:t xml:space="preserve">3215</w:t>
+            </w:r>
+          </w:p>
+          <w:p>
+            <w:pPr>
+              <w:spacing w:before="0" w:after="0" w:line="276" w:lineRule="exact"/>
+              <w:ind w:left="0" w:firstLine="0"/>
+              <w:jc w:val="left"/>
             </w:pPr>
             <w:r>
               <w:t xml:space="preserve">mac@dakotabankruptcy.com</w:t>
@@ -1077,23 +2189,39 @@
           </w:p>
           <w:p>
             <w:pPr>
-              <w:pStyle w:val="SingleSpaced"/>
-            </w:pPr>
-            <w:r>
-              <w:t xml:space="preserve">Counsel for the Debtor</w:t>
+              <w:spacing w:before="0" w:after="0" w:line="276" w:lineRule="exact"/>
+              <w:ind w:left="0" w:firstLine="0"/>
+              <w:jc w:val="left"/>
+            </w:pPr>
+            <w:r>
+              <w:t xml:space="preserve">Counsel</w:t>
+            </w:r>
+            <w:r>
+              <w:t xml:space="preserve"> </w:t>
+            </w:r>
+            <w:r>
+              <w:t xml:space="preserve">for</w:t>
+            </w:r>
+            <w:r>
+              <w:t xml:space="preserve"> </w:t>
+            </w:r>
+            <w:r>
+              <w:t xml:space="preserve">the</w:t>
+            </w:r>
+            <w:r>
+              <w:t xml:space="preserve"> </w:t>
+            </w:r>
+            <w:r>
+              <w:t xml:space="preserve">Debtor</w:t>
             </w:r>
           </w:p>
         </w:tc>
       </w:tr>
     </w:tbl>
-    <w:bookmarkEnd w:id="26"/>
     <w:sectPr>
-      <w:footerReference r:id="rId9" w:type="default"/>
-      <w:footnotePr>
-        <w:numRestart w:val="eachSect"/>
-      </w:footnotePr>
-      <w:pgSz w:h="15840" w:w="12240"/>
-      <w:pgMar w:bottom="1440" w:footer="720" w:gutter="0" w:header="720" w:left="1440" w:right="1440" w:top="1440"/>
+      <w:footerReference w:type="default" r:id="rIdFooter1"/>
+      <w:pgSz w:w="12240" w:h="15840"/>
+      <w:pgMar w:top="1440" w:right="1440" w:bottom="1440" w:left="1440" w:header="720" w:footer="735" w:gutter="0"/>
     </w:sectPr>
   </w:body>
 </w:document>
@@ -1107,7 +2235,6 @@
 <w:ftr xmlns:w="http://schemas.openxmlformats.org/wordprocessingml/2006/main" xmlns:r="http://schemas.openxmlformats.org/officeDocument/2006/relationships">
   <w:p>
     <w:pPr>
-      <w:spacing w:before="0" w:after="0" w:line="240" w:lineRule="auto"/>
       <w:jc w:val="center"/>
     </w:pPr>
     <w:r>
@@ -1233,211 +2360,724 @@
 </file>
 
 <file path=word/styles.xml><?xml version="1.0" encoding="utf-8"?>
-<w:styles xmlns:w="http://schemas.openxmlformats.org/wordprocessingml/2006/main">
+<w:styles xmlns:r="http://schemas.openxmlformats.org/officeDocument/2006/relationships" xmlns:w="http://schemas.openxmlformats.org/wordprocessingml/2006/main">
   <w:docDefaults>
     <w:rPrDefault>
       <w:rPr>
-        <w:rFonts w:ascii="EB Garamond" w:cs="EB Garamond" w:eastAsia="EB Garamond" w:hAnsi="EB Garamond"/>
+        <w:rFonts w:ascii="Times New Roman" w:hAnsi="Times New Roman" w:eastAsia="Times New Roman" w:cs="Times New Roman"/>
         <w:sz w:val="24"/>
         <w:szCs w:val="24"/>
-        <w:lang w:bidi="ar-SA" w:eastAsia="en-US" w:val="en-US"/>
+        <w:lang w:val="en-US" w:eastAsia="zh-CN" w:bidi="ar-SA"/>
       </w:rPr>
     </w:rPrDefault>
     <w:pPrDefault>
       <w:pPr>
-        <w:spacing w:after="0" w:before="0" w:line="552" w:lineRule="exact"/>
+        <w:widowControl/>
+        <w:spacing w:after="0"/>
       </w:pPr>
     </w:pPrDefault>
   </w:docDefaults>
-  <w:style w:default="1" w:styleId="Normal" w:type="paragraph">
+  <w:latentStyles w:defLockedState="0" w:defUIPriority="0" w:defSemiHidden="0" w:defUnhideWhenUsed="0" w:defQFormat="0" w:count="276"/>
+  <w:style w:type="paragraph" w:default="1" w:styleId="Normal">
     <w:name w:val="Normal"/>
     <w:qFormat/>
   </w:style>
-  <w:style w:default="1" w:styleId="DefaultParagraphFont" w:type="character">
-    <w:name w:val="Default Paragraph Font"/>
-    <w:uiPriority w:val="1"/>
-    <w:semiHidden/>
-    <w:unhideWhenUsed/>
-  </w:style>
-  <w:style w:default="1" w:styleId="TableNormal" w:type="table">
-    <w:name w:val="Normal Table"/>
-    <w:uiPriority w:val="99"/>
-    <w:semiHidden/>
-    <w:unhideWhenUsed/>
-    <w:tblPr>
-      <w:tblInd w:type="dxa" w:w="0"/>
-      <w:tblCellMar>
-        <w:top w:type="dxa" w:w="0"/>
-        <w:left w:type="dxa" w:w="108"/>
-        <w:bottom w:type="dxa" w:w="0"/>
-        <w:right w:type="dxa" w:w="108"/>
-      </w:tblCellMar>
-    </w:tblPr>
-  </w:style>
-  <w:style w:default="1" w:styleId="NoList" w:type="numbering">
-    <w:name w:val="No List"/>
-    <w:uiPriority w:val="99"/>
-    <w:semiHidden/>
-    <w:unhideWhenUsed/>
-  </w:style>
-  <w:style w:styleId="BodyText" w:type="paragraph">
+  <w:style w:type="paragraph" w:styleId="BodyText">
     <w:name w:val="Body Text"/>
     <w:basedOn w:val="Normal"/>
+    <w:link w:val="BodyTextChar"/>
     <w:qFormat/>
-  </w:style>
-  <w:style w:styleId="FirstParagraph" w:type="paragraph">
+    <w:pPr>
+      <w:spacing w:before="0" w:after="0" w:line="552" w:lineRule="exact"/>
+      <w:ind w:firstLine="720"/>
+    </w:pPr>
+  </w:style>
+  <w:style w:type="paragraph" w:customStyle="1" w:styleId="FirstParagraph">
     <w:name w:val="First Paragraph"/>
     <w:basedOn w:val="BodyText"/>
     <w:next w:val="BodyText"/>
     <w:qFormat/>
   </w:style>
-  <w:style w:styleId="Compact" w:type="paragraph">
+  <w:style w:type="paragraph" w:customStyle="1" w:styleId="Compact">
     <w:name w:val="Compact"/>
     <w:basedOn w:val="BodyText"/>
     <w:qFormat/>
-  </w:style>
-  <w:style w:customStyle="1" w:styleId="NumberedParagraph" w:type="paragraph">
-    <w:name w:val="Numbered Paragraph"/>
-    <w:basedOn w:val="BodyText"/>
+    <w:pPr>
+      <w:spacing w:before="36" w:after="36"/>
+    </w:pPr>
+  </w:style>
+  <w:style w:type="paragraph" w:styleId="Title">
+    <w:name w:val="Title"/>
+    <w:basedOn w:val="Normal"/>
+    <w:next w:val="BodyText"/>
+    <w:link w:val="TitleChar"/>
+    <w:uiPriority w:val="10"/>
     <w:qFormat/>
+    <w:rsid w:val="00A10FD9"/>
     <w:pPr>
-      <w:ind w:firstLine="720"/>
+      <w:spacing w:after="80" w:line="240" w:lineRule="auto"/>
+      <w:contextualSpacing/>
+      <w:jc w:val="center"/>
     </w:pPr>
-  </w:style>
-  <w:style w:customStyle="1" w:styleId="NumberedParagraphKeepNext" w:type="paragraph">
-    <w:name w:val="Numbered Paragraph Keep Next"/>
-    <w:basedOn w:val="NumberedParagraph"/>
+    <w:rPr>
+      <w:rFonts w:asciiTheme="majorHAnsi" w:eastAsiaTheme="majorEastAsia" w:hAnsiTheme="majorHAnsi" w:cstheme="majorBidi"/>
+      <w:sz w:val="56"/>
+      <w:szCs w:val="56"/>
+    </w:rPr>
+  </w:style>
+  <w:style w:type="character" w:customStyle="1" w:styleId="TitleChar">
+    <w:name w:val="Title Char"/>
+    <w:basedOn w:val="DefaultParagraphFont"/>
+    <w:link w:val="Title"/>
+    <w:uiPriority w:val="10"/>
+    <w:rsid w:val="00A10FD9"/>
+    <w:rPr>
+      <w:rFonts w:asciiTheme="majorHAnsi" w:eastAsiaTheme="majorEastAsia" w:hAnsiTheme="majorHAnsi" w:cstheme="majorBidi"/>
+      <w:sz w:val="56"/>
+      <w:szCs w:val="56"/>
+    </w:rPr>
+  </w:style>
+  <w:style w:type="paragraph" w:styleId="Subtitle">
+    <w:name w:val="Subtitle"/>
+    <w:basedOn w:val="Title"/>
+    <w:next w:val="BodyText"/>
+    <w:link w:val="SubtitleChar"/>
+    <w:uiPriority w:val="11"/>
+    <w:qFormat/>
+    <w:rsid w:val="00A10FD9"/>
+    <w:pPr>
+      <w:numPr>
+        <w:ilvl w:val="1"/>
+      </w:numPr>
+    </w:pPr>
+    <w:rPr>
+      <w:rFonts w:eastAsiaTheme="majorEastAsia" w:cstheme="majorBidi"/>
+      <w:spacing w:val="15"/>
+      <w:sz w:val="28"/>
+      <w:szCs w:val="28"/>
+    </w:rPr>
+  </w:style>
+  <w:style w:type="character" w:customStyle="1" w:styleId="SubtitleChar">
+    <w:name w:val="Subtitle Char"/>
+    <w:basedOn w:val="DefaultParagraphFont"/>
+    <w:link w:val="Subtitle"/>
+    <w:uiPriority w:val="11"/>
+    <w:rsid w:val="00A10FD9"/>
+    <w:rPr>
+      <w:rFonts w:eastAsiaTheme="majorEastAsia" w:cstheme="majorBidi"/>
+      <w:color w:val="595959" w:themeColor="text1" w:themeTint="A6"/>
+      <w:spacing w:val="15"/>
+      <w:sz w:val="28"/>
+      <w:szCs w:val="28"/>
+    </w:rPr>
+  </w:style>
+  <w:style w:type="paragraph" w:customStyle="1" w:styleId="Author">
+    <w:name w:val="Author"/>
+    <w:basedOn w:val="Title"/>
+    <w:next w:val="BodyText"/>
     <w:qFormat/>
     <w:pPr>
       <w:keepNext/>
       <w:keepLines/>
     </w:pPr>
-  </w:style>
-  <w:style w:styleId="BlockText" w:type="paragraph">
-    <w:name w:val="Block Text"/>
-    <w:basedOn w:val="BodyText"/>
+    <w:rPr>
+      <w:sz w:val="24"/>
+      <w:szCs w:val="24"/>
+    </w:rPr>
+  </w:style>
+  <w:style w:type="paragraph" w:styleId="Date">
+    <w:name w:val="Date"/>
+    <w:basedOn w:val="Title"/>
     <w:next w:val="BodyText"/>
-    <w:qFormat/>
-    <w:pPr>
-      <w:spacing w:after="552" w:before="0" w:line="276" w:lineRule="exact"/>
-      <w:ind w:firstLine="0" w:left="720" w:right="720"/>
-    </w:pPr>
-  </w:style>
-  <w:style w:styleId="Heading1" w:type="paragraph">
-    <w:name w:val="heading 1"/>
-    <w:basedOn w:val="Normal"/>
-    <w:next w:val="BodyText"/>
-    <w:uiPriority w:val="9"/>
     <w:qFormat/>
     <w:pPr>
       <w:keepNext/>
       <w:keepLines/>
-      <w:spacing w:after="0" w:before="0" w:line="552" w:lineRule="exact"/>
+    </w:pPr>
+    <w:rPr>
+      <w:sz w:val="24"/>
+      <w:szCs w:val="24"/>
+    </w:rPr>
+  </w:style>
+  <w:style w:type="paragraph" w:customStyle="1" w:styleId="AbstractTitle">
+    <w:name w:val="Abstract Title"/>
+    <w:basedOn w:val="Normal"/>
+    <w:next w:val="Abstract"/>
+    <w:qFormat/>
+    <w:pPr>
+      <w:keepNext/>
+      <w:keepLines/>
+      <w:spacing w:before="300" w:after="0"/>
+      <w:jc w:val="center"/>
+    </w:pPr>
+    <w:rPr>
+      <w:b/>
+      <w:sz w:val="20"/>
+      <w:szCs w:val="20"/>
+    </w:rPr>
+  </w:style>
+  <w:style w:type="paragraph" w:customStyle="1" w:styleId="Abstract">
+    <w:name w:val="Abstract"/>
+    <w:basedOn w:val="Normal"/>
+    <w:next w:val="BodyText"/>
+    <w:qFormat/>
+    <w:pPr>
+      <w:keepNext/>
+      <w:keepLines/>
+      <w:spacing w:before="100" w:after="300"/>
+    </w:pPr>
+    <w:rPr>
+      <w:sz w:val="20"/>
+      <w:szCs w:val="20"/>
+    </w:rPr>
+  </w:style>
+  <w:style w:type="paragraph" w:styleId="Bibliography">
+    <w:name w:val="Bibliography"/>
+    <w:basedOn w:val="Normal"/>
+    <w:next w:val="Bibliography"/>
+    <w:qFormat/>
+    <w:pPr/>
+    <w:rPr/>
+  </w:style>
+  <w:style w:type="paragraph" w:styleId="Heading1">
+    <w:name w:val="heading 1"/>
+    <w:basedOn w:val="Normal"/>
+    <w:next w:val="BodyText"/>
+    <w:link w:val="Heading1Char"/>
+    <w:uiPriority w:val="9"/>
+    <w:qFormat/>
+    <w:rsid w:val="00A10FD9"/>
+    <w:pPr>
+      <w:keepNext/>
+      <w:keepLines/>
+      <w:spacing w:before="0" w:after="0" w:line="552" w:lineRule="exact"/>
       <w:ind w:firstLine="0"/>
       <w:jc w:val="center"/>
       <w:outlineLvl w:val="0"/>
     </w:pPr>
     <w:rPr>
+      <w:rFonts w:ascii="Times New Roman" w:hAnsi="Times New Roman" w:eastAsia="Times New Roman" w:cs="Times New Roman"/>
+      <w:b/>
+      <w:bCs/>
+      <w:caps/>
+      <w:color w:val="000000"/>
+      <w:sz w:val="24"/>
+      <w:szCs w:val="24"/>
+    </w:rPr>
+  </w:style>
+  <w:style w:type="paragraph" w:styleId="Heading2">
+    <w:name w:val="heading 2"/>
+    <w:basedOn w:val="Normal"/>
+    <w:next w:val="BodyText"/>
+    <w:link w:val="Heading2Char"/>
+    <w:uiPriority w:val="9"/>
+    <w:semiHidden/>
+    <w:unhideWhenUsed/>
+    <w:qFormat/>
+    <w:rsid w:val="00A10FD9"/>
+    <w:pPr>
+      <w:keepNext/>
+      <w:keepLines/>
+      <w:spacing w:before="0" w:after="0" w:line="552" w:lineRule="exact"/>
+      <w:ind w:firstLine="0"/>
+      <w:outlineLvl w:val="1"/>
+    </w:pPr>
+    <w:rPr>
+      <w:rFonts w:ascii="Times New Roman" w:hAnsi="Times New Roman" w:eastAsia="Times New Roman" w:cs="Times New Roman"/>
       <w:b/>
       <w:bCs/>
       <w:color w:val="000000"/>
-    </w:rPr>
-  </w:style>
-  <w:style w:styleId="Heading2" w:type="paragraph">
-    <w:name w:val="heading 2"/>
-    <w:basedOn w:val="Heading1"/>
+      <w:sz w:val="24"/>
+      <w:szCs w:val="24"/>
+    </w:rPr>
+  </w:style>
+  <w:style w:type="paragraph" w:styleId="Heading3">
+    <w:name w:val="heading 3"/>
+    <w:basedOn w:val="Normal"/>
+    <w:next w:val="BodyText"/>
+    <w:link w:val="Heading3Char"/>
+    <w:uiPriority w:val="9"/>
+    <w:semiHidden/>
+    <w:unhideWhenUsed/>
+    <w:qFormat/>
+    <w:rsid w:val="00A10FD9"/>
+    <w:pPr>
+      <w:keepNext/>
+      <w:keepLines/>
+      <w:spacing w:before="0" w:after="0" w:line="552" w:lineRule="exact"/>
+      <w:ind w:firstLine="0"/>
+      <w:outlineLvl w:val="2"/>
+    </w:pPr>
+    <w:rPr>
+      <w:rFonts w:ascii="Times New Roman" w:hAnsi="Times New Roman" w:eastAsia="Times New Roman" w:cs="Times New Roman"/>
+      <w:b/>
+      <w:bCs/>
+      <w:color w:val="000000"/>
+      <w:sz w:val="24"/>
+      <w:szCs w:val="24"/>
+    </w:rPr>
+  </w:style>
+  <w:style w:type="paragraph" w:styleId="Heading4">
+    <w:name w:val="heading 4"/>
+    <w:basedOn w:val="Normal"/>
+    <w:next w:val="BodyText"/>
+    <w:link w:val="Heading4Char"/>
+    <w:uiPriority w:val="9"/>
+    <w:semiHidden/>
+    <w:unhideWhenUsed/>
+    <w:qFormat/>
+    <w:rsid w:val="00A10FD9"/>
+    <w:pPr>
+      <w:keepNext/>
+      <w:keepLines/>
+      <w:spacing w:before="0" w:after="0" w:line="552" w:lineRule="exact"/>
+      <w:ind w:firstLine="0"/>
+      <w:outlineLvl w:val="3"/>
+    </w:pPr>
+    <w:rPr>
+      <w:rFonts w:ascii="Times New Roman" w:hAnsi="Times New Roman" w:eastAsia="Times New Roman" w:cs="Times New Roman"/>
+      <w:b/>
+      <w:bCs/>
+      <w:i/>
+      <w:color w:val="000000"/>
+      <w:sz w:val="24"/>
+      <w:szCs w:val="24"/>
+    </w:rPr>
+  </w:style>
+  <w:style w:type="paragraph" w:styleId="Heading5">
+    <w:name w:val="heading 5"/>
+    <w:basedOn w:val="Normal"/>
+    <w:next w:val="BodyText"/>
+    <w:link w:val="Heading5Char"/>
+    <w:uiPriority w:val="9"/>
+    <w:semiHidden/>
+    <w:unhideWhenUsed/>
+    <w:qFormat/>
+    <w:rsid w:val="00A10FD9"/>
+    <w:pPr>
+      <w:keepNext/>
+      <w:keepLines/>
+      <w:spacing w:before="0" w:after="0" w:line="552" w:lineRule="exact"/>
+      <w:ind w:firstLine="0"/>
+      <w:outlineLvl w:val="4"/>
+    </w:pPr>
+    <w:rPr>
+      <w:rFonts w:ascii="Times New Roman" w:hAnsi="Times New Roman" w:eastAsia="Times New Roman" w:cs="Times New Roman"/>
+      <w:b/>
+      <w:bCs/>
+      <w:i/>
+      <w:color w:val="000000"/>
+      <w:sz w:val="24"/>
+      <w:szCs w:val="24"/>
+    </w:rPr>
+  </w:style>
+  <w:style w:type="paragraph" w:styleId="Heading6">
+    <w:name w:val="heading 6"/>
+    <w:basedOn w:val="Normal"/>
+    <w:next w:val="BodyText"/>
+    <w:link w:val="Heading6Char"/>
+    <w:uiPriority w:val="9"/>
+    <w:semiHidden/>
+    <w:unhideWhenUsed/>
+    <w:qFormat/>
+    <w:rsid w:val="00A10FD9"/>
+    <w:pPr>
+      <w:keepNext/>
+      <w:keepLines/>
+      <w:spacing w:before="40" w:after="0"/>
+      <w:outlineLvl w:val="5"/>
+    </w:pPr>
+    <w:rPr>
+      <w:rFonts w:eastAsiaTheme="majorEastAsia" w:cstheme="majorBidi"/>
+      <w:i/>
+      <w:iCs/>
+      <w:color w:val="595959" w:themeColor="text1" w:themeTint="A6"/>
+    </w:rPr>
+  </w:style>
+  <w:style w:type="paragraph" w:styleId="Heading7">
+    <w:name w:val="heading 7"/>
+    <w:basedOn w:val="Normal"/>
+    <w:next w:val="BodyText"/>
+    <w:link w:val="Heading7Char"/>
+    <w:uiPriority w:val="9"/>
+    <w:semiHidden/>
+    <w:unhideWhenUsed/>
+    <w:qFormat/>
+    <w:rsid w:val="00A10FD9"/>
+    <w:pPr>
+      <w:keepNext/>
+      <w:keepLines/>
+      <w:spacing w:before="40" w:after="0"/>
+      <w:outlineLvl w:val="6"/>
+    </w:pPr>
+    <w:rPr>
+      <w:rFonts w:eastAsiaTheme="majorEastAsia" w:cstheme="majorBidi"/>
+      <w:color w:val="595959" w:themeColor="text1" w:themeTint="A6"/>
+    </w:rPr>
+  </w:style>
+  <w:style w:type="paragraph" w:styleId="Heading8">
+    <w:name w:val="heading 8"/>
+    <w:basedOn w:val="Normal"/>
+    <w:next w:val="BodyText"/>
+    <w:link w:val="Heading8Char"/>
+    <w:uiPriority w:val="9"/>
+    <w:semiHidden/>
+    <w:unhideWhenUsed/>
+    <w:qFormat/>
+    <w:rsid w:val="00A10FD9"/>
+    <w:pPr>
+      <w:keepNext/>
+      <w:keepLines/>
+      <w:spacing w:after="0"/>
+      <w:outlineLvl w:val="7"/>
+    </w:pPr>
+    <w:rPr>
+      <w:rFonts w:eastAsiaTheme="majorEastAsia" w:cstheme="majorBidi"/>
+      <w:i/>
+      <w:iCs/>
+      <w:color w:val="272727" w:themeColor="text1" w:themeTint="D8"/>
+    </w:rPr>
+  </w:style>
+  <w:style w:type="paragraph" w:styleId="Heading9">
+    <w:name w:val="heading 9"/>
+    <w:basedOn w:val="Normal"/>
+    <w:next w:val="BodyText"/>
+    <w:link w:val="Heading9Char"/>
+    <w:uiPriority w:val="9"/>
+    <w:semiHidden/>
+    <w:unhideWhenUsed/>
+    <w:qFormat/>
+    <w:rsid w:val="00A10FD9"/>
+    <w:pPr>
+      <w:keepNext/>
+      <w:keepLines/>
+      <w:spacing w:after="0"/>
+      <w:outlineLvl w:val="8"/>
+    </w:pPr>
+    <w:rPr>
+      <w:rFonts w:eastAsiaTheme="majorEastAsia" w:cstheme="majorBidi"/>
+      <w:color w:val="272727" w:themeColor="text1" w:themeTint="D8"/>
+    </w:rPr>
+  </w:style>
+  <w:style w:type="character" w:customStyle="1" w:styleId="Heading1Char">
+    <w:name w:val="Heading 1 Char"/>
+    <w:basedOn w:val="DefaultParagraphFont"/>
+    <w:link w:val="Heading1"/>
+    <w:uiPriority w:val="9"/>
+    <w:rsid w:val="00A10FD9"/>
+    <w:rPr>
+      <w:rFonts w:asciiTheme="majorHAnsi" w:eastAsiaTheme="majorEastAsia" w:hAnsiTheme="majorHAnsi" w:cstheme="majorBidi"/>
+      <w:color w:val="0F4761" w:themeColor="accent1" w:themeShade="BF"/>
+      <w:sz w:val="40"/>
+      <w:szCs w:val="40"/>
+    </w:rPr>
+  </w:style>
+  <w:style w:type="character" w:customStyle="1" w:styleId="Heading2Char">
+    <w:name w:val="Heading 2 Char"/>
+    <w:basedOn w:val="DefaultParagraphFont"/>
+    <w:link w:val="Heading2"/>
+    <w:uiPriority w:val="9"/>
+    <w:semiHidden/>
+    <w:rsid w:val="00A10FD9"/>
+    <w:rPr>
+      <w:rFonts w:asciiTheme="majorHAnsi" w:eastAsiaTheme="majorEastAsia" w:hAnsiTheme="majorHAnsi" w:cstheme="majorBidi"/>
+      <w:color w:val="0F4761" w:themeColor="accent1" w:themeShade="BF"/>
+      <w:sz w:val="32"/>
+      <w:szCs w:val="32"/>
+    </w:rPr>
+  </w:style>
+  <w:style w:type="character" w:customStyle="1" w:styleId="Heading3Char">
+    <w:name w:val="Heading 3 Char"/>
+    <w:basedOn w:val="DefaultParagraphFont"/>
+    <w:link w:val="Heading3"/>
+    <w:uiPriority w:val="9"/>
+    <w:semiHidden/>
+    <w:rsid w:val="00A10FD9"/>
+    <w:rPr>
+      <w:rFonts w:eastAsiaTheme="majorEastAsia" w:cstheme="majorBidi"/>
+      <w:color w:val="0F4761" w:themeColor="accent1" w:themeShade="BF"/>
+      <w:sz w:val="28"/>
+      <w:szCs w:val="28"/>
+    </w:rPr>
+  </w:style>
+  <w:style w:type="character" w:customStyle="1" w:styleId="Heading4Char">
+    <w:name w:val="Heading 4 Char"/>
+    <w:basedOn w:val="DefaultParagraphFont"/>
+    <w:link w:val="Heading4"/>
+    <w:uiPriority w:val="9"/>
+    <w:semiHidden/>
+    <w:rsid w:val="00A10FD9"/>
+    <w:rPr>
+      <w:rFonts w:eastAsiaTheme="majorEastAsia" w:cstheme="majorBidi"/>
+      <w:i/>
+      <w:iCs/>
+      <w:color w:val="0F4761" w:themeColor="accent1" w:themeShade="BF"/>
+    </w:rPr>
+  </w:style>
+  <w:style w:type="character" w:customStyle="1" w:styleId="Heading5Char">
+    <w:name w:val="Heading 5 Char"/>
+    <w:basedOn w:val="DefaultParagraphFont"/>
+    <w:link w:val="Heading5"/>
+    <w:uiPriority w:val="9"/>
+    <w:semiHidden/>
+    <w:rsid w:val="00A10FD9"/>
+    <w:rPr>
+      <w:rFonts w:eastAsiaTheme="majorEastAsia" w:cstheme="majorBidi"/>
+      <w:color w:val="0F4761" w:themeColor="accent1" w:themeShade="BF"/>
+    </w:rPr>
+  </w:style>
+  <w:style w:type="character" w:customStyle="1" w:styleId="Heading6Char">
+    <w:name w:val="Heading 6 Char"/>
+    <w:basedOn w:val="DefaultParagraphFont"/>
+    <w:link w:val="Heading6"/>
+    <w:uiPriority w:val="9"/>
+    <w:semiHidden/>
+    <w:rsid w:val="00A10FD9"/>
+    <w:rPr>
+      <w:rFonts w:eastAsiaTheme="majorEastAsia" w:cstheme="majorBidi"/>
+      <w:i/>
+      <w:iCs/>
+      <w:color w:val="595959" w:themeColor="text1" w:themeTint="A6"/>
+    </w:rPr>
+  </w:style>
+  <w:style w:type="character" w:customStyle="1" w:styleId="Heading7Char">
+    <w:name w:val="Heading 7 Char"/>
+    <w:basedOn w:val="DefaultParagraphFont"/>
+    <w:link w:val="Heading7"/>
+    <w:uiPriority w:val="9"/>
+    <w:semiHidden/>
+    <w:rsid w:val="00A10FD9"/>
+    <w:rPr>
+      <w:rFonts w:eastAsiaTheme="majorEastAsia" w:cstheme="majorBidi"/>
+      <w:color w:val="595959" w:themeColor="text1" w:themeTint="A6"/>
+    </w:rPr>
+  </w:style>
+  <w:style w:type="character" w:customStyle="1" w:styleId="Heading8Char">
+    <w:name w:val="Heading 8 Char"/>
+    <w:basedOn w:val="DefaultParagraphFont"/>
+    <w:link w:val="Heading8"/>
+    <w:uiPriority w:val="9"/>
+    <w:semiHidden/>
+    <w:rsid w:val="00A10FD9"/>
+    <w:rPr>
+      <w:rFonts w:eastAsiaTheme="majorEastAsia" w:cstheme="majorBidi"/>
+      <w:i/>
+      <w:iCs/>
+      <w:color w:val="272727" w:themeColor="text1" w:themeTint="D8"/>
+    </w:rPr>
+  </w:style>
+  <w:style w:type="character" w:customStyle="1" w:styleId="Heading9Char">
+    <w:name w:val="Heading 9 Char"/>
+    <w:basedOn w:val="DefaultParagraphFont"/>
+    <w:link w:val="Heading9"/>
+    <w:uiPriority w:val="9"/>
+    <w:semiHidden/>
+    <w:rsid w:val="00A10FD9"/>
+    <w:rPr>
+      <w:rFonts w:eastAsiaTheme="majorEastAsia" w:cstheme="majorBidi"/>
+      <w:color w:val="272727" w:themeColor="text1" w:themeTint="D8"/>
+    </w:rPr>
+  </w:style>
+  <w:style w:type="paragraph" w:customStyle="1" w:styleId="ListItem">
+    <w:name w:val="List Item"/>
+    <w:basedOn w:val="BodyText"/>
+    <w:qFormat/>
+    <w:pPr>
+      <w:spacing w:before="0" w:after="0" w:line="552" w:lineRule="exact"/>
+      <w:ind w:left="720" w:hanging="720"/>
+    </w:pPr>
+  </w:style>
+  <w:style w:type="paragraph" w:styleId="BlockText">
+    <w:name w:val="Block Text"/>
+    <w:basedOn w:val="BodyText"/>
     <w:next w:val="BodyText"/>
     <w:uiPriority w:val="9"/>
     <w:unhideWhenUsed/>
     <w:qFormat/>
     <w:pPr>
-      <w:outlineLvl w:val="1"/>
+      <w:spacing w:before="276" w:after="276" w:line="276" w:lineRule="exact"/>
+      <w:ind w:firstLine="0" w:left="720" w:right="720"/>
     </w:pPr>
   </w:style>
-  <w:style w:styleId="Heading3" w:type="paragraph">
-    <w:name w:val="heading 3"/>
-    <w:basedOn w:val="Heading1"/>
-    <w:next w:val="BodyText"/>
+  <w:style w:type="paragraph" w:styleId="FootnoteText">
+    <w:name w:val="Footnote Text"/>
+    <w:basedOn w:val="Normal"/>
+    <w:next w:val="FootnoteText"/>
     <w:uiPriority w:val="9"/>
     <w:unhideWhenUsed/>
     <w:qFormat/>
     <w:pPr>
-      <w:outlineLvl w:val="2"/>
+      <w:keepLines/>
+      <w:spacing w:before="0" w:after="140" w:line="276" w:lineRule="exact"/>
     </w:pPr>
-  </w:style>
-  <w:style w:customStyle="1" w:styleId="TitleLine" w:type="paragraph">
-    <w:name w:val="Title Line"/>
+    <w:rPr>
+      <w:sz w:val="24"/>
+      <w:szCs w:val="24"/>
+    </w:rPr>
+  </w:style>
+  <w:style w:type="paragraph" w:styleId="FootnoteBlockText">
+    <w:name w:val="Footnote Block Text"/>
+    <w:basedOn w:val="FootnoteText"/>
+    <w:next w:val="FootnoteText"/>
+    <w:uiPriority w:val="9"/>
+    <w:unhideWhenUsed/>
+    <w:qFormat/>
+    <w:pPr>
+      <w:spacing w:before="276" w:after="276"/>
+      <w:ind w:firstLine="0" w:left="720" w:right="720"/>
+    </w:pPr>
+  </w:style>
+  <w:style w:type="character" w:default="1" w:styleId="DefaultParagraphFont">
+    <w:name w:val="Default Paragraph Font"/>
+    <w:semiHidden/>
+    <w:unhideWhenUsed/>
+  </w:style>
+  <w:style w:type="table" w:default="1" w:styleId="Table">
+    <w:name w:val="Table"/>
+    <w:basedOn w:val="TableNormal"/>
+    <w:qFormat/>
+    <w:tblPr>
+      <w:tblInd w:w="0" w:type="dxa"/>
+      <w:tblCellMar>
+        <w:top w:w="0" w:type="dxa"/>
+        <w:left w:w="108" w:type="dxa"/>
+        <w:bottom w:w="0" w:type="dxa"/>
+        <w:right w:w="108" w:type="dxa"/>
+      </w:tblCellMar>
+    </w:tblPr>
+    <w:tblStylePr w:type="firstRow">
+      <w:tcPr>
+        <w:tcBorders>
+          <w:bottom w:val="single"/>
+        </w:tcBorders>
+        <w:vAlign w:val="bottom"/>
+      </w:tcPr>
+    </w:tblStylePr>
+  </w:style>
+  <w:style w:type="paragraph" w:customStyle="1" w:styleId="DefinitionTerm">
+    <w:name w:val="Definition Term"/>
     <w:basedOn w:val="Normal"/>
+    <w:next w:val="Definition"/>
+    <w:pPr>
+      <w:keepNext/>
+      <w:keepLines/>
+      <w:spacing w:after="0"/>
+    </w:pPr>
+    <w:rPr>
+      <w:b/>
+    </w:rPr>
+  </w:style>
+  <w:style w:type="paragraph" w:customStyle="1" w:styleId="Definition">
+    <w:name w:val="Definition"/>
+    <w:basedOn w:val="Normal"/>
+  </w:style>
+  <w:style w:type="paragraph" w:styleId="Caption">
+    <w:name w:val="Caption"/>
+    <w:basedOn w:val="Normal"/>
+    <w:link w:val="BodyTextChar"/>
+    <w:pPr>
+      <w:spacing w:before="0" w:after="120"/>
+    </w:pPr>
+    <w:rPr>
+      <w:i/>
+    </w:rPr>
+  </w:style>
+  <w:style w:type="paragraph" w:customStyle="1" w:styleId="TableCaption">
+    <w:name w:val="Table Caption"/>
+    <w:basedOn w:val="Caption"/>
+    <w:pPr>
+      <w:keepNext/>
+    </w:pPr>
+  </w:style>
+  <w:style w:type="paragraph" w:customStyle="1" w:styleId="ImageCaption">
+    <w:name w:val="Image Caption"/>
+    <w:basedOn w:val="Caption"/>
+  </w:style>
+  <w:style w:type="paragraph" w:customStyle="1" w:styleId="Figure">
+    <w:name w:val="Figure"/>
+    <w:basedOn w:val="Normal"/>
+  </w:style>
+  <w:style w:type="paragraph" w:customStyle="1" w:styleId="CaptionedFigure">
+    <w:name w:val="Captioned Figure"/>
+    <w:basedOn w:val="Figure"/>
+    <w:pPr>
+      <w:keepNext/>
+    </w:pPr>
+  </w:style>
+  <w:style w:type="character" w:customStyle="1" w:styleId="BodyTextChar">
+    <w:name w:val="Body Text Char"/>
+    <w:basedOn w:val="DefaultParagraphFont"/>
+    <w:link w:val="BodyText"/>
+  </w:style>
+  <w:style w:type="character" w:customStyle="1" w:styleId="VerbatimChar">
+    <w:name w:val="Verbatim Char"/>
+    <w:basedOn w:val="BodyTextChar"/>
+    <w:rPr>
+      <w:rFonts w:ascii="Consolas" w:hAnsi="Consolas"/>
+      <w:sz w:val="22"/>
+    </w:rPr>
+  </w:style>
+  <w:style w:type="character" w:customStyle="1" w:styleId="SectionNumber">
+    <w:name w:val="Section Number"/>
+    <w:basedOn w:val="BodyTextChar"/>
+  </w:style>
+  <w:style w:type="character" w:styleId="FootnoteReference">
+    <w:name w:val="Footnote Reference"/>
+    <w:basedOn w:val="BodyTextChar"/>
+    <w:rPr>
+      <w:vertAlign w:val="superscript"/>
+    </w:rPr>
+  </w:style>
+  <w:style w:type="character" w:styleId="Hyperlink">
+    <w:name w:val="Hyperlink"/>
+    <w:basedOn w:val="BodyTextChar"/>
+    <w:rPr>
+      <w:color w:val="000000"/>
+    </w:rPr>
+  </w:style>
+  <w:style w:type="paragraph" w:styleId="TOCHeading">
+    <w:name w:val="TOC Heading"/>
+    <w:basedOn w:val="Heading1"/>
+    <w:next w:val="BodyText"/>
+    <w:uiPriority w:val="39"/>
+    <w:unhideWhenUsed/>
+    <w:qFormat/>
+    <w:pPr>
+      <w:spacing w:before="240" w:line="259" w:lineRule="auto"/>
+      <w:outlineLvl w:val="9"/>
+    </w:pPr>
+    <w:rPr>
+      <w:rFonts w:asciiTheme="majorHAnsi" w:eastAsiaTheme="majorEastAsia" w:hAnsiTheme="majorHAnsi" w:cstheme="majorBidi"/>
+      <w:b w:val="0"/>
+      <w:bCs w:val="0"/>
+      <w:color w:val="365F91" w:themeColor="accent1" w:themeShade="BF"/>
+    </w:rPr>
+  </w:style>
+  <w:style w:type="paragraph" w:customStyle="1" w:styleId="BodyTextFlush">
+    <w:name w:val="Body Text Flush"/>
+    <w:basedOn w:val="BodyText"/>
+    <w:qFormat/>
+    <w:pPr>
+      <w:ind w:firstLine="0"/>
+    </w:pPr>
+  </w:style>
+  <w:style w:type="paragraph" w:customStyle="1" w:styleId="BodyTextKeep">
+    <w:name w:val="Body Text Keep"/>
+    <w:basedOn w:val="BodyText"/>
     <w:qFormat/>
     <w:pPr>
       <w:keepNext/>
-      <w:spacing w:after="0" w:before="0" w:line="552" w:lineRule="exact"/>
-      <w:ind w:firstLine="0"/>
-      <w:jc w:val="center"/>
+      <w:keepLines/>
     </w:pPr>
-    <w:rPr>
-      <w:b/>
-      <w:bCs/>
-    </w:rPr>
-  </w:style>
-  <w:style w:customStyle="1" w:styleId="CourtName" w:type="paragraph">
-    <w:name w:val="Court Name"/>
-    <w:basedOn w:val="Normal"/>
+  </w:style>
+  <w:style w:type="paragraph" w:customStyle="1" w:styleId="BodyTextFlushKeep">
+    <w:name w:val="Body Text Flush Keep"/>
+    <w:basedOn w:val="BodyTextFlush"/>
     <w:qFormat/>
     <w:pPr>
-      <w:spacing w:after="0" w:before="0" w:line="276" w:lineRule="exact"/>
-      <w:jc w:val="center"/>
+      <w:keepNext/>
+      <w:keepLines/>
     </w:pPr>
-    <w:rPr>
-      <w:b/>
-      <w:bCs/>
-    </w:rPr>
-  </w:style>
-  <w:style w:customStyle="1" w:styleId="SingleSpaced" w:type="paragraph">
-    <w:name w:val="Single Spaced"/>
-    <w:basedOn w:val="Normal"/>
-    <w:qFormat/>
-    <w:pPr>
-      <w:spacing w:after="0" w:before="0" w:line="276" w:lineRule="exact"/>
-    </w:pPr>
-  </w:style>
-  <w:style w:styleId="FootnoteText" w:type="paragraph">
-    <w:name w:val="footnote text"/>
-    <w:basedOn w:val="Normal"/>
-    <w:uiPriority w:val="99"/>
-    <w:unhideWhenUsed/>
-    <w:pPr>
-      <w:spacing w:after="0" w:before="0" w:line="276" w:lineRule="exact"/>
-    </w:pPr>
-    <w:rPr>
-      <w:sz w:val="24"/>
-      <w:szCs w:val="24"/>
-    </w:rPr>
-  </w:style>
-  <w:style w:styleId="FootnoteReference" w:type="character">
-    <w:name w:val="footnote reference"/>
-    <w:basedOn w:val="DefaultParagraphFont"/>
-    <w:uiPriority w:val="99"/>
-    <w:unhideWhenUsed/>
-    <w:rPr>
-      <w:vertAlign w:val="superscript"/>
-    </w:rPr>
-  </w:style>
-  <w:style w:styleId="Hyperlink" w:type="character">
-    <w:name w:val="Hyperlink"/>
-    <w:basedOn w:val="DefaultParagraphFont"/>
-    <w:uiPriority w:val="99"/>
-    <w:unhideWhenUsed/>
-    <w:rPr>
-      <w:color w:val="000000"/>
-      <w:u w:val="single"/>
-    </w:rPr>
-  </w:style>
-  <w:style w:styleId="VerbatimChar" w:type="character">
-    <w:name w:val="Verbatim Char"/>
-    <w:basedOn w:val="DefaultParagraphFont"/>
-    <w:uiPriority w:val="99"/>
-    <w:unhideWhenUsed/>
   </w:style>
   <w:style w:type="paragraph" w:customStyle="1" w:styleId="SourceCode">
     <w:name w:val="Source Code"/>

</xml_diff>